<commit_message>
Bug report: plain layout, one page per bug
</commit_message>
<xml_diff>
--- a/docs/qa-seeded-bugs/QA-seeded-bugs.docx
+++ b/docs/qa-seeded-bugs/QA-seeded-bugs.docx
@@ -3,31 +3,12 @@
 <w:document xmlns:wpc="http://schemas.microsoft.com/office/word/2010/wordprocessingCanvas" xmlns:mo="http://schemas.microsoft.com/office/mac/office/2008/main" xmlns:mc="http://schemas.openxmlformats.org/markup-compatibility/2006" xmlns:mv="urn:schemas-microsoft-com:mac:vml" xmlns:o="urn:schemas-microsoft-com:office:office" xmlns:r="http://schemas.openxmlformats.org/officeDocument/2006/relationships" xmlns:m="http://schemas.openxmlformats.org/officeDocument/2006/math" xmlns:v="urn:schemas-microsoft-com:vml" xmlns:wp14="http://schemas.microsoft.com/office/word/2010/wordprocessingDrawing" xmlns:wp="http://schemas.openxmlformats.org/drawingml/2006/wordprocessingDrawing" xmlns:w10="urn:schemas-microsoft-com:office:word" xmlns:w="http://schemas.openxmlformats.org/wordprocessingml/2006/main" xmlns:w14="http://schemas.microsoft.com/office/word/2010/wordml" xmlns:wpg="http://schemas.microsoft.com/office/word/2010/wordprocessingGroup" xmlns:wpi="http://schemas.microsoft.com/office/word/2010/wordprocessingInk" xmlns:wne="http://schemas.microsoft.com/office/word/2006/wordml" xmlns:wps="http://schemas.microsoft.com/office/word/2010/wordprocessingShape" mc:Ignorable="w14 wp14">
   <w:body>
     <w:p>
-      <w:pPr>
-        <w:pStyle w:val="Title"/>
-      </w:pPr>
       <w:r>
-        <w:t>Inventory -- Test Report: 7 seeded bugs</w:t>
-      </w:r>
-    </w:p>
-    <w:p>
-      <w:r>
-        <w:t>This is a practice test document. Seven small bugs were added on purpose to the Inventory app.</w:t>
-      </w:r>
-    </w:p>
-    <w:p>
-      <w:r>
-        <w:t>The bugs are ONLY on the git branch "qa/seeded-bugs" (folder D:\villy\inventory\frontend-qa-bugs). The main app (branch main) is not changed.</w:t>
-      </w:r>
-    </w:p>
-    <w:p>
-      <w:r>
-        <w:t>All seven bugs are on the screen only. None of them saves wrong data, so testing them cannot damage the shop data.</w:t>
-      </w:r>
-    </w:p>
-    <w:p>
-      <w:r>
-        <w:t>For each bug: the steps to see it, what SHOULD happen (expected), what DOES happen (actual), a screenshot of both, and the exact place in the code where it breaks.</w:t>
+        <w:rPr>
+          <w:b/>
+          <w:sz w:val="32"/>
+        </w:rPr>
+        <w:t>Inventory - Bug Report</w:t>
       </w:r>
     </w:p>
     <w:p>
@@ -35,126 +16,43 @@
         <w:pStyle w:val="Heading1"/>
       </w:pPr>
       <w:r>
-        <w:t>Test setup</w:t>
-      </w:r>
-    </w:p>
-    <w:p>
-      <w:pPr>
-        <w:pStyle w:val="ListBullet"/>
-      </w:pPr>
-      <w:r>
-        <w:t>Branch: qa/seeded-bugs  (frontend only; the backend is not changed)</w:t>
-      </w:r>
-    </w:p>
-    <w:p>
-      <w:pPr>
-        <w:pStyle w:val="ListBullet"/>
-      </w:pPr>
-      <w:r>
-        <w:t>Bug app: http://localhost:5190  (started from frontend-qa-bugs)</w:t>
-      </w:r>
-    </w:p>
-    <w:p>
-      <w:pPr>
-        <w:pStyle w:val="ListBullet"/>
-      </w:pPr>
-      <w:r>
-        <w:t>Normal app for comparison: the main frontend (npm run dev in frontend)</w:t>
-      </w:r>
-    </w:p>
-    <w:p>
-      <w:pPr>
-        <w:pStyle w:val="ListBullet"/>
-      </w:pPr>
-      <w:r>
-        <w:t>Backend: local, http://localhost:4006</w:t>
-      </w:r>
-    </w:p>
-    <w:p>
-      <w:pPr>
-        <w:pStyle w:val="ListBullet"/>
-      </w:pPr>
-      <w:r>
-        <w:t>Test shop: Lakshmi Silks (demo test shop) -- signed in as the owner</w:t>
-      </w:r>
-    </w:p>
-    <w:p>
-      <w:pPr>
-        <w:pStyle w:val="ListBullet"/>
-      </w:pPr>
-      <w:r>
-        <w:t>Date tested: 15 Oct 2026, Microsoft Edge, screen 1366 x 900, language English (India)</w:t>
-      </w:r>
-    </w:p>
-    <w:p>
-      <w:pPr>
-        <w:pStyle w:val="Heading1"/>
-      </w:pPr>
-      <w:r>
-        <w:t>Summary</w:t>
+        <w:t>Test Environment</w:t>
       </w:r>
     </w:p>
     <w:tbl>
       <w:tblPr>
-        <w:tblStyle w:val="LightGrid-Accent1"/>
+        <w:tblStyle w:val="TableGrid"/>
         <w:tblW w:type="auto" w:w="0"/>
         <w:tblLook w:firstColumn="1" w:firstRow="1" w:lastColumn="0" w:lastRow="0" w:noHBand="0" w:noVBand="1" w:val="04A0"/>
       </w:tblPr>
       <w:tblGrid>
-        <w:gridCol w:w="1728"/>
-        <w:gridCol w:w="1728"/>
-        <w:gridCol w:w="1728"/>
-        <w:gridCol w:w="1728"/>
-        <w:gridCol w:w="1728"/>
+        <w:gridCol w:w="4320"/>
+        <w:gridCol w:w="4320"/>
       </w:tblGrid>
       <w:tr>
         <w:tc>
           <w:tcPr>
-            <w:tcW w:type="dxa" w:w="1728"/>
+            <w:tcW w:type="dxa" w:w="2304"/>
           </w:tcPr>
           <w:p>
             <w:r>
-              <w:t>ID</w:t>
+              <w:rPr>
+                <w:b/>
+              </w:rPr>
+              <w:t>Application</w:t>
             </w:r>
           </w:p>
         </w:tc>
         <w:tc>
           <w:tcPr>
-            <w:tcW w:type="dxa" w:w="1728"/>
+            <w:tcW w:type="dxa" w:w="6624"/>
           </w:tcPr>
           <w:p>
             <w:r>
-              <w:t>Bug</w:t>
-            </w:r>
-          </w:p>
-        </w:tc>
-        <w:tc>
-          <w:tcPr>
-            <w:tcW w:type="dxa" w:w="1728"/>
-          </w:tcPr>
-          <w:p>
-            <w:r>
-              <w:t>Page</w:t>
-            </w:r>
-          </w:p>
-        </w:tc>
-        <w:tc>
-          <w:tcPr>
-            <w:tcW w:type="dxa" w:w="1728"/>
-          </w:tcPr>
-          <w:p>
-            <w:r>
-              <w:t>Severity</w:t>
-            </w:r>
-          </w:p>
-        </w:tc>
-        <w:tc>
-          <w:tcPr>
-            <w:tcW w:type="dxa" w:w="1728"/>
-          </w:tcPr>
-          <w:p>
-            <w:r>
-              <w:t>Result</w:t>
+              <w:rPr>
+                <w:b w:val="0"/>
+              </w:rPr>
+              <w:t>ScaleEzy Inventory (web)</w:t>
             </w:r>
           </w:p>
         </w:tc>
@@ -162,51 +60,27 @@
       <w:tr>
         <w:tc>
           <w:tcPr>
-            <w:tcW w:type="dxa" w:w="1728"/>
+            <w:tcW w:type="dxa" w:w="2304"/>
           </w:tcPr>
           <w:p>
             <w:r>
-              <w:t>BUG-01</w:t>
+              <w:rPr>
+                <w:b/>
+              </w:rPr>
+              <w:t>Branch</w:t>
             </w:r>
           </w:p>
         </w:tc>
         <w:tc>
           <w:tcPr>
-            <w:tcW w:type="dxa" w:w="1728"/>
+            <w:tcW w:type="dxa" w:w="6624"/>
           </w:tcPr>
           <w:p>
             <w:r>
-              <w:t>Purchase order search does not find a PO when you type capital letters</w:t>
-            </w:r>
-          </w:p>
-        </w:tc>
-        <w:tc>
-          <w:tcPr>
-            <w:tcW w:type="dxa" w:w="1728"/>
-          </w:tcPr>
-          <w:p>
-            <w:r>
-              <w:t>Purchase Orders  (/inventory/purchase-orders)</w:t>
-            </w:r>
-          </w:p>
-        </w:tc>
-        <w:tc>
-          <w:tcPr>
-            <w:tcW w:type="dxa" w:w="1728"/>
-          </w:tcPr>
-          <w:p>
-            <w:r>
-              <w:t>Minor</w:t>
-            </w:r>
-          </w:p>
-        </w:tc>
-        <w:tc>
-          <w:tcPr>
-            <w:tcW w:type="dxa" w:w="1728"/>
-          </w:tcPr>
-          <w:p>
-            <w:r>
-              <w:t>FAIL</w:t>
+              <w:rPr>
+                <w:b w:val="0"/>
+              </w:rPr>
+              <w:t>qa/seeded-bugs</w:t>
             </w:r>
           </w:p>
         </w:tc>
@@ -214,51 +88,27 @@
       <w:tr>
         <w:tc>
           <w:tcPr>
-            <w:tcW w:type="dxa" w:w="1728"/>
+            <w:tcW w:type="dxa" w:w="2304"/>
           </w:tcPr>
           <w:p>
             <w:r>
-              <w:t>BUG-02</w:t>
+              <w:rPr>
+                <w:b/>
+              </w:rPr>
+              <w:t>URL</w:t>
             </w:r>
           </w:p>
         </w:tc>
         <w:tc>
           <w:tcPr>
-            <w:tcW w:type="dxa" w:w="1728"/>
+            <w:tcW w:type="dxa" w:w="6624"/>
           </w:tcPr>
           <w:p>
             <w:r>
-              <w:t>Supplier search does not find a supplier by name</w:t>
-            </w:r>
-          </w:p>
-        </w:tc>
-        <w:tc>
-          <w:tcPr>
-            <w:tcW w:type="dxa" w:w="1728"/>
-          </w:tcPr>
-          <w:p>
-            <w:r>
-              <w:t>Suppliers  (/inventory/suppliers)</w:t>
-            </w:r>
-          </w:p>
-        </w:tc>
-        <w:tc>
-          <w:tcPr>
-            <w:tcW w:type="dxa" w:w="1728"/>
-          </w:tcPr>
-          <w:p>
-            <w:r>
-              <w:t>Minor</w:t>
-            </w:r>
-          </w:p>
-        </w:tc>
-        <w:tc>
-          <w:tcPr>
-            <w:tcW w:type="dxa" w:w="1728"/>
-          </w:tcPr>
-          <w:p>
-            <w:r>
-              <w:t>FAIL</w:t>
+              <w:rPr>
+                <w:b w:val="0"/>
+              </w:rPr>
+              <w:t>http://localhost:5190</w:t>
             </w:r>
           </w:p>
         </w:tc>
@@ -266,51 +116,27 @@
       <w:tr>
         <w:tc>
           <w:tcPr>
-            <w:tcW w:type="dxa" w:w="1728"/>
+            <w:tcW w:type="dxa" w:w="2304"/>
           </w:tcPr>
           <w:p>
             <w:r>
-              <w:t>BUG-03</w:t>
+              <w:rPr>
+                <w:b/>
+              </w:rPr>
+              <w:t>Test shop</w:t>
             </w:r>
           </w:p>
         </w:tc>
         <w:tc>
           <w:tcPr>
-            <w:tcW w:type="dxa" w:w="1728"/>
+            <w:tcW w:type="dxa" w:w="6624"/>
           </w:tcPr>
           <w:p>
             <w:r>
-              <w:t>The "Out of Stock" tab shows a count of -1</w:t>
-            </w:r>
-          </w:p>
-        </w:tc>
-        <w:tc>
-          <w:tcPr>
-            <w:tcW w:type="dxa" w:w="1728"/>
-          </w:tcPr>
-          <w:p>
-            <w:r>
-              <w:t>Stock alerts  (/inventory/alerts)</w:t>
-            </w:r>
-          </w:p>
-        </w:tc>
-        <w:tc>
-          <w:tcPr>
-            <w:tcW w:type="dxa" w:w="1728"/>
-          </w:tcPr>
-          <w:p>
-            <w:r>
-              <w:t>Minor</w:t>
-            </w:r>
-          </w:p>
-        </w:tc>
-        <w:tc>
-          <w:tcPr>
-            <w:tcW w:type="dxa" w:w="1728"/>
-          </w:tcPr>
-          <w:p>
-            <w:r>
-              <w:t>FAIL</w:t>
+              <w:rPr>
+                <w:b w:val="0"/>
+              </w:rPr>
+              <w:t>Lakshmi Silks (demo), Owner login</w:t>
             </w:r>
           </w:p>
         </w:tc>
@@ -318,51 +144,27 @@
       <w:tr>
         <w:tc>
           <w:tcPr>
-            <w:tcW w:type="dxa" w:w="1728"/>
+            <w:tcW w:type="dxa" w:w="2304"/>
           </w:tcPr>
           <w:p>
             <w:r>
-              <w:t>BUG-04</w:t>
+              <w:rPr>
+                <w:b/>
+              </w:rPr>
+              <w:t>Browser</w:t>
             </w:r>
           </w:p>
         </w:tc>
         <w:tc>
           <w:tcPr>
-            <w:tcW w:type="dxa" w:w="1728"/>
+            <w:tcW w:type="dxa" w:w="6624"/>
           </w:tcPr>
           <w:p>
             <w:r>
-              <w:t>A stock of 0 is not shown in red</w:t>
-            </w:r>
-          </w:p>
-        </w:tc>
-        <w:tc>
-          <w:tcPr>
-            <w:tcW w:type="dxa" w:w="1728"/>
-          </w:tcPr>
-          <w:p>
-            <w:r>
-              <w:t>Inventory Overview  (/inventory)</w:t>
-            </w:r>
-          </w:p>
-        </w:tc>
-        <w:tc>
-          <w:tcPr>
-            <w:tcW w:type="dxa" w:w="1728"/>
-          </w:tcPr>
-          <w:p>
-            <w:r>
-              <w:t>Minor</w:t>
-            </w:r>
-          </w:p>
-        </w:tc>
-        <w:tc>
-          <w:tcPr>
-            <w:tcW w:type="dxa" w:w="1728"/>
-          </w:tcPr>
-          <w:p>
-            <w:r>
-              <w:t>FAIL</w:t>
+              <w:rPr>
+                <w:b w:val="0"/>
+              </w:rPr>
+              <w:t>Microsoft Edge, 1366 x 900</w:t>
             </w:r>
           </w:p>
         </w:tc>
@@ -370,51 +172,130 @@
       <w:tr>
         <w:tc>
           <w:tcPr>
-            <w:tcW w:type="dxa" w:w="1728"/>
+            <w:tcW w:type="dxa" w:w="2304"/>
           </w:tcPr>
           <w:p>
             <w:r>
-              <w:t>BUG-05</w:t>
+              <w:rPr>
+                <w:b/>
+              </w:rPr>
+              <w:t>Date</w:t>
             </w:r>
           </w:p>
         </w:tc>
         <w:tc>
           <w:tcPr>
-            <w:tcW w:type="dxa" w:w="1728"/>
+            <w:tcW w:type="dxa" w:w="6624"/>
           </w:tcPr>
           <w:p>
             <w:r>
-              <w:t>Products page: "Stock Units" shows the number of variants, not the stock</w:t>
+              <w:rPr>
+                <w:b w:val="0"/>
+              </w:rPr>
+              <w:t>15-10-2026</w:t>
+            </w:r>
+          </w:p>
+        </w:tc>
+      </w:tr>
+    </w:tbl>
+    <w:p>
+      <w:pPr>
+        <w:pStyle w:val="Heading1"/>
+      </w:pPr>
+      <w:r>
+        <w:t>Bug Summary</w:t>
+      </w:r>
+    </w:p>
+    <w:tbl>
+      <w:tblPr>
+        <w:tblStyle w:val="TableGrid"/>
+        <w:tblW w:type="auto" w:w="0"/>
+        <w:tblLook w:firstColumn="1" w:firstRow="1" w:lastColumn="0" w:lastRow="0" w:noHBand="0" w:noVBand="1" w:val="04A0"/>
+      </w:tblPr>
+      <w:tblGrid>
+        <w:gridCol w:w="1440"/>
+        <w:gridCol w:w="1440"/>
+        <w:gridCol w:w="1440"/>
+        <w:gridCol w:w="1440"/>
+        <w:gridCol w:w="1440"/>
+        <w:gridCol w:w="1440"/>
+      </w:tblGrid>
+      <w:tr>
+        <w:tc>
+          <w:tcPr>
+            <w:tcW w:type="dxa" w:w="1008"/>
+          </w:tcPr>
+          <w:p>
+            <w:r>
+              <w:rPr>
+                <w:b/>
+              </w:rPr>
+              <w:t>Bug ID</w:t>
             </w:r>
           </w:p>
         </w:tc>
         <w:tc>
           <w:tcPr>
-            <w:tcW w:type="dxa" w:w="1728"/>
+            <w:tcW w:type="dxa" w:w="3456"/>
           </w:tcPr>
           <w:p>
             <w:r>
-              <w:t>Products  (/products)</w:t>
+              <w:rPr>
+                <w:b/>
+              </w:rPr>
+              <w:t>Title</w:t>
             </w:r>
           </w:p>
         </w:tc>
         <w:tc>
           <w:tcPr>
-            <w:tcW w:type="dxa" w:w="1728"/>
+            <w:tcW w:type="dxa" w:w="1584"/>
           </w:tcPr>
           <w:p>
             <w:r>
-              <w:t>Minor</w:t>
+              <w:rPr>
+                <w:b/>
+              </w:rPr>
+              <w:t>Module</w:t>
             </w:r>
           </w:p>
         </w:tc>
         <w:tc>
           <w:tcPr>
-            <w:tcW w:type="dxa" w:w="1728"/>
+            <w:tcW w:type="dxa" w:w="1008"/>
           </w:tcPr>
           <w:p>
             <w:r>
-              <w:t>FAIL</w:t>
+              <w:rPr>
+                <w:b/>
+              </w:rPr>
+              <w:t>Severity</w:t>
+            </w:r>
+          </w:p>
+        </w:tc>
+        <w:tc>
+          <w:tcPr>
+            <w:tcW w:type="dxa" w:w="1008"/>
+          </w:tcPr>
+          <w:p>
+            <w:r>
+              <w:rPr>
+                <w:b/>
+              </w:rPr>
+              <w:t>Priority</w:t>
+            </w:r>
+          </w:p>
+        </w:tc>
+        <w:tc>
+          <w:tcPr>
+            <w:tcW w:type="dxa" w:w="864"/>
+          </w:tcPr>
+          <w:p>
+            <w:r>
+              <w:rPr>
+                <w:b/>
+              </w:rPr>
+              <w:t>Status</w:t>
             </w:r>
           </w:p>
         </w:tc>
@@ -422,51 +303,79 @@
       <w:tr>
         <w:tc>
           <w:tcPr>
-            <w:tcW w:type="dxa" w:w="1728"/>
+            <w:tcW w:type="dxa" w:w="1008"/>
           </w:tcPr>
           <w:p>
             <w:r>
-              <w:t>BUG-06</w:t>
+              <w:rPr>
+                <w:b w:val="0"/>
+              </w:rPr>
+              <w:t>BUG-01</w:t>
             </w:r>
           </w:p>
         </w:tc>
         <w:tc>
           <w:tcPr>
-            <w:tcW w:type="dxa" w:w="1728"/>
+            <w:tcW w:type="dxa" w:w="3456"/>
           </w:tcPr>
           <w:p>
             <w:r>
-              <w:t>Customers page: the "Created" date shows the wrong month</w:t>
+              <w:rPr>
+                <w:b w:val="0"/>
+              </w:rPr>
+              <w:t>PO search fails for capital letters</w:t>
             </w:r>
           </w:p>
         </w:tc>
         <w:tc>
           <w:tcPr>
-            <w:tcW w:type="dxa" w:w="1728"/>
+            <w:tcW w:type="dxa" w:w="1584"/>
           </w:tcPr>
           <w:p>
             <w:r>
-              <w:t>Customers  (/customers)</w:t>
+              <w:rPr>
+                <w:b w:val="0"/>
+              </w:rPr>
+              <w:t>Purchase Orders</w:t>
             </w:r>
           </w:p>
         </w:tc>
         <w:tc>
           <w:tcPr>
-            <w:tcW w:type="dxa" w:w="1728"/>
+            <w:tcW w:type="dxa" w:w="1008"/>
           </w:tcPr>
           <w:p>
             <w:r>
+              <w:rPr>
+                <w:b w:val="0"/>
+              </w:rPr>
               <w:t>Minor</w:t>
             </w:r>
           </w:p>
         </w:tc>
         <w:tc>
           <w:tcPr>
-            <w:tcW w:type="dxa" w:w="1728"/>
+            <w:tcW w:type="dxa" w:w="1008"/>
           </w:tcPr>
           <w:p>
             <w:r>
-              <w:t>FAIL</w:t>
+              <w:rPr>
+                <w:b w:val="0"/>
+              </w:rPr>
+              <w:t>Medium</w:t>
+            </w:r>
+          </w:p>
+        </w:tc>
+        <w:tc>
+          <w:tcPr>
+            <w:tcW w:type="dxa" w:w="864"/>
+          </w:tcPr>
+          <w:p>
+            <w:r>
+              <w:rPr>
+                <w:b w:val="0"/>
+              </w:rPr>
+              <w:t>Open</w:t>
             </w:r>
           </w:p>
         </w:tc>
@@ -474,148 +383,781 @@
       <w:tr>
         <w:tc>
           <w:tcPr>
-            <w:tcW w:type="dxa" w:w="1728"/>
+            <w:tcW w:type="dxa" w:w="1008"/>
           </w:tcPr>
           <w:p>
             <w:r>
+              <w:rPr>
+                <w:b w:val="0"/>
+              </w:rPr>
+              <w:t>BUG-02</w:t>
+            </w:r>
+          </w:p>
+        </w:tc>
+        <w:tc>
+          <w:tcPr>
+            <w:tcW w:type="dxa" w:w="3456"/>
+          </w:tcPr>
+          <w:p>
+            <w:r>
+              <w:rPr>
+                <w:b w:val="0"/>
+              </w:rPr>
+              <w:t>Supplier search does not find supplier by name</w:t>
+            </w:r>
+          </w:p>
+        </w:tc>
+        <w:tc>
+          <w:tcPr>
+            <w:tcW w:type="dxa" w:w="1584"/>
+          </w:tcPr>
+          <w:p>
+            <w:r>
+              <w:rPr>
+                <w:b w:val="0"/>
+              </w:rPr>
+              <w:t>Suppliers</w:t>
+            </w:r>
+          </w:p>
+        </w:tc>
+        <w:tc>
+          <w:tcPr>
+            <w:tcW w:type="dxa" w:w="1008"/>
+          </w:tcPr>
+          <w:p>
+            <w:r>
+              <w:rPr>
+                <w:b w:val="0"/>
+              </w:rPr>
+              <w:t>Minor</w:t>
+            </w:r>
+          </w:p>
+        </w:tc>
+        <w:tc>
+          <w:tcPr>
+            <w:tcW w:type="dxa" w:w="1008"/>
+          </w:tcPr>
+          <w:p>
+            <w:r>
+              <w:rPr>
+                <w:b w:val="0"/>
+              </w:rPr>
+              <w:t>Medium</w:t>
+            </w:r>
+          </w:p>
+        </w:tc>
+        <w:tc>
+          <w:tcPr>
+            <w:tcW w:type="dxa" w:w="864"/>
+          </w:tcPr>
+          <w:p>
+            <w:r>
+              <w:rPr>
+                <w:b w:val="0"/>
+              </w:rPr>
+              <w:t>Open</w:t>
+            </w:r>
+          </w:p>
+        </w:tc>
+      </w:tr>
+      <w:tr>
+        <w:tc>
+          <w:tcPr>
+            <w:tcW w:type="dxa" w:w="1008"/>
+          </w:tcPr>
+          <w:p>
+            <w:r>
+              <w:rPr>
+                <w:b w:val="0"/>
+              </w:rPr>
+              <w:t>BUG-03</w:t>
+            </w:r>
+          </w:p>
+        </w:tc>
+        <w:tc>
+          <w:tcPr>
+            <w:tcW w:type="dxa" w:w="3456"/>
+          </w:tcPr>
+          <w:p>
+            <w:r>
+              <w:rPr>
+                <w:b w:val="0"/>
+              </w:rPr>
+              <w:t>Out of Stock tab shows -1</w:t>
+            </w:r>
+          </w:p>
+        </w:tc>
+        <w:tc>
+          <w:tcPr>
+            <w:tcW w:type="dxa" w:w="1584"/>
+          </w:tcPr>
+          <w:p>
+            <w:r>
+              <w:rPr>
+                <w:b w:val="0"/>
+              </w:rPr>
+              <w:t>Stock Alerts</w:t>
+            </w:r>
+          </w:p>
+        </w:tc>
+        <w:tc>
+          <w:tcPr>
+            <w:tcW w:type="dxa" w:w="1008"/>
+          </w:tcPr>
+          <w:p>
+            <w:r>
+              <w:rPr>
+                <w:b w:val="0"/>
+              </w:rPr>
+              <w:t>Minor</w:t>
+            </w:r>
+          </w:p>
+        </w:tc>
+        <w:tc>
+          <w:tcPr>
+            <w:tcW w:type="dxa" w:w="1008"/>
+          </w:tcPr>
+          <w:p>
+            <w:r>
+              <w:rPr>
+                <w:b w:val="0"/>
+              </w:rPr>
+              <w:t>Low</w:t>
+            </w:r>
+          </w:p>
+        </w:tc>
+        <w:tc>
+          <w:tcPr>
+            <w:tcW w:type="dxa" w:w="864"/>
+          </w:tcPr>
+          <w:p>
+            <w:r>
+              <w:rPr>
+                <w:b w:val="0"/>
+              </w:rPr>
+              <w:t>Open</w:t>
+            </w:r>
+          </w:p>
+        </w:tc>
+      </w:tr>
+      <w:tr>
+        <w:tc>
+          <w:tcPr>
+            <w:tcW w:type="dxa" w:w="1008"/>
+          </w:tcPr>
+          <w:p>
+            <w:r>
+              <w:rPr>
+                <w:b w:val="0"/>
+              </w:rPr>
+              <w:t>BUG-04</w:t>
+            </w:r>
+          </w:p>
+        </w:tc>
+        <w:tc>
+          <w:tcPr>
+            <w:tcW w:type="dxa" w:w="3456"/>
+          </w:tcPr>
+          <w:p>
+            <w:r>
+              <w:rPr>
+                <w:b w:val="0"/>
+              </w:rPr>
+              <w:t>Zero stock is not shown in red</w:t>
+            </w:r>
+          </w:p>
+        </w:tc>
+        <w:tc>
+          <w:tcPr>
+            <w:tcW w:type="dxa" w:w="1584"/>
+          </w:tcPr>
+          <w:p>
+            <w:r>
+              <w:rPr>
+                <w:b w:val="0"/>
+              </w:rPr>
+              <w:t>Inventory</w:t>
+            </w:r>
+          </w:p>
+        </w:tc>
+        <w:tc>
+          <w:tcPr>
+            <w:tcW w:type="dxa" w:w="1008"/>
+          </w:tcPr>
+          <w:p>
+            <w:r>
+              <w:rPr>
+                <w:b w:val="0"/>
+              </w:rPr>
+              <w:t>Minor</w:t>
+            </w:r>
+          </w:p>
+        </w:tc>
+        <w:tc>
+          <w:tcPr>
+            <w:tcW w:type="dxa" w:w="1008"/>
+          </w:tcPr>
+          <w:p>
+            <w:r>
+              <w:rPr>
+                <w:b w:val="0"/>
+              </w:rPr>
+              <w:t>Low</w:t>
+            </w:r>
+          </w:p>
+        </w:tc>
+        <w:tc>
+          <w:tcPr>
+            <w:tcW w:type="dxa" w:w="864"/>
+          </w:tcPr>
+          <w:p>
+            <w:r>
+              <w:rPr>
+                <w:b w:val="0"/>
+              </w:rPr>
+              <w:t>Open</w:t>
+            </w:r>
+          </w:p>
+        </w:tc>
+      </w:tr>
+      <w:tr>
+        <w:tc>
+          <w:tcPr>
+            <w:tcW w:type="dxa" w:w="1008"/>
+          </w:tcPr>
+          <w:p>
+            <w:r>
+              <w:rPr>
+                <w:b w:val="0"/>
+              </w:rPr>
+              <w:t>BUG-05</w:t>
+            </w:r>
+          </w:p>
+        </w:tc>
+        <w:tc>
+          <w:tcPr>
+            <w:tcW w:type="dxa" w:w="3456"/>
+          </w:tcPr>
+          <w:p>
+            <w:r>
+              <w:rPr>
+                <w:b w:val="0"/>
+              </w:rPr>
+              <w:t>Stock Units column shows variant count</w:t>
+            </w:r>
+          </w:p>
+        </w:tc>
+        <w:tc>
+          <w:tcPr>
+            <w:tcW w:type="dxa" w:w="1584"/>
+          </w:tcPr>
+          <w:p>
+            <w:r>
+              <w:rPr>
+                <w:b w:val="0"/>
+              </w:rPr>
+              <w:t>Products</w:t>
+            </w:r>
+          </w:p>
+        </w:tc>
+        <w:tc>
+          <w:tcPr>
+            <w:tcW w:type="dxa" w:w="1008"/>
+          </w:tcPr>
+          <w:p>
+            <w:r>
+              <w:rPr>
+                <w:b w:val="0"/>
+              </w:rPr>
+              <w:t>Major</w:t>
+            </w:r>
+          </w:p>
+        </w:tc>
+        <w:tc>
+          <w:tcPr>
+            <w:tcW w:type="dxa" w:w="1008"/>
+          </w:tcPr>
+          <w:p>
+            <w:r>
+              <w:rPr>
+                <w:b w:val="0"/>
+              </w:rPr>
+              <w:t>High</w:t>
+            </w:r>
+          </w:p>
+        </w:tc>
+        <w:tc>
+          <w:tcPr>
+            <w:tcW w:type="dxa" w:w="864"/>
+          </w:tcPr>
+          <w:p>
+            <w:r>
+              <w:rPr>
+                <w:b w:val="0"/>
+              </w:rPr>
+              <w:t>Open</w:t>
+            </w:r>
+          </w:p>
+        </w:tc>
+      </w:tr>
+      <w:tr>
+        <w:tc>
+          <w:tcPr>
+            <w:tcW w:type="dxa" w:w="1008"/>
+          </w:tcPr>
+          <w:p>
+            <w:r>
+              <w:rPr>
+                <w:b w:val="0"/>
+              </w:rPr>
+              <w:t>BUG-06</w:t>
+            </w:r>
+          </w:p>
+        </w:tc>
+        <w:tc>
+          <w:tcPr>
+            <w:tcW w:type="dxa" w:w="3456"/>
+          </w:tcPr>
+          <w:p>
+            <w:r>
+              <w:rPr>
+                <w:b w:val="0"/>
+              </w:rPr>
+              <w:t>Customer created date shows wrong month</w:t>
+            </w:r>
+          </w:p>
+        </w:tc>
+        <w:tc>
+          <w:tcPr>
+            <w:tcW w:type="dxa" w:w="1584"/>
+          </w:tcPr>
+          <w:p>
+            <w:r>
+              <w:rPr>
+                <w:b w:val="0"/>
+              </w:rPr>
+              <w:t>Customers</w:t>
+            </w:r>
+          </w:p>
+        </w:tc>
+        <w:tc>
+          <w:tcPr>
+            <w:tcW w:type="dxa" w:w="1008"/>
+          </w:tcPr>
+          <w:p>
+            <w:r>
+              <w:rPr>
+                <w:b w:val="0"/>
+              </w:rPr>
+              <w:t>Minor</w:t>
+            </w:r>
+          </w:p>
+        </w:tc>
+        <w:tc>
+          <w:tcPr>
+            <w:tcW w:type="dxa" w:w="1008"/>
+          </w:tcPr>
+          <w:p>
+            <w:r>
+              <w:rPr>
+                <w:b w:val="0"/>
+              </w:rPr>
+              <w:t>Medium</w:t>
+            </w:r>
+          </w:p>
+        </w:tc>
+        <w:tc>
+          <w:tcPr>
+            <w:tcW w:type="dxa" w:w="864"/>
+          </w:tcPr>
+          <w:p>
+            <w:r>
+              <w:rPr>
+                <w:b w:val="0"/>
+              </w:rPr>
+              <w:t>Open</w:t>
+            </w:r>
+          </w:p>
+        </w:tc>
+      </w:tr>
+      <w:tr>
+        <w:tc>
+          <w:tcPr>
+            <w:tcW w:type="dxa" w:w="1008"/>
+          </w:tcPr>
+          <w:p>
+            <w:r>
+              <w:rPr>
+                <w:b w:val="0"/>
+              </w:rPr>
               <w:t>BUG-07</w:t>
             </w:r>
           </w:p>
         </w:tc>
         <w:tc>
           <w:tcPr>
-            <w:tcW w:type="dxa" w:w="1728"/>
+            <w:tcW w:type="dxa" w:w="3456"/>
           </w:tcPr>
           <w:p>
             <w:r>
-              <w:t>Dashboard: the top supplier is ranked "#0"</w:t>
+              <w:rPr>
+                <w:b w:val="0"/>
+              </w:rPr>
+              <w:t>Top supplier rank starts from #0</w:t>
             </w:r>
           </w:p>
         </w:tc>
         <w:tc>
           <w:tcPr>
-            <w:tcW w:type="dxa" w:w="1728"/>
+            <w:tcW w:type="dxa" w:w="1584"/>
           </w:tcPr>
           <w:p>
             <w:r>
-              <w:t>Dashboard, Analytics tab, "Top Suppliers" card  (/dashboard)</w:t>
+              <w:rPr>
+                <w:b w:val="0"/>
+              </w:rPr>
+              <w:t>Dashboard</w:t>
             </w:r>
           </w:p>
         </w:tc>
         <w:tc>
           <w:tcPr>
-            <w:tcW w:type="dxa" w:w="1728"/>
+            <w:tcW w:type="dxa" w:w="1008"/>
           </w:tcPr>
           <w:p>
             <w:r>
-              <w:t>Minor (looks wrong)</w:t>
+              <w:rPr>
+                <w:b w:val="0"/>
+              </w:rPr>
+              <w:t>Minor</w:t>
             </w:r>
           </w:p>
         </w:tc>
         <w:tc>
           <w:tcPr>
-            <w:tcW w:type="dxa" w:w="1728"/>
+            <w:tcW w:type="dxa" w:w="1008"/>
           </w:tcPr>
           <w:p>
             <w:r>
-              <w:t>FAIL</w:t>
+              <w:rPr>
+                <w:b w:val="0"/>
+              </w:rPr>
+              <w:t>Low</w:t>
+            </w:r>
+          </w:p>
+        </w:tc>
+        <w:tc>
+          <w:tcPr>
+            <w:tcW w:type="dxa" w:w="864"/>
+          </w:tcPr>
+          <w:p>
+            <w:r>
+              <w:rPr>
+                <w:b w:val="0"/>
+              </w:rPr>
+              <w:t>Open</w:t>
             </w:r>
           </w:p>
         </w:tc>
       </w:tr>
     </w:tbl>
     <w:p>
+      <w:pPr>
+        <w:pStyle w:val="Heading1"/>
+        <w:pageBreakBefore/>
+      </w:pPr>
       <w:r>
-        <w:br w:type="page"/>
+        <w:t>BUG-01 - PO search fails for capital letters</w:t>
       </w:r>
     </w:p>
+    <w:tbl>
+      <w:tblPr>
+        <w:tblStyle w:val="TableGrid"/>
+        <w:tblW w:type="auto" w:w="0"/>
+        <w:tblLook w:firstColumn="1" w:firstRow="1" w:lastColumn="0" w:lastRow="0" w:noHBand="0" w:noVBand="1" w:val="04A0"/>
+      </w:tblPr>
+      <w:tblGrid>
+        <w:gridCol w:w="4320"/>
+        <w:gridCol w:w="4320"/>
+      </w:tblGrid>
+      <w:tr>
+        <w:tc>
+          <w:tcPr>
+            <w:tcW w:type="dxa" w:w="2016"/>
+          </w:tcPr>
+          <w:p>
+            <w:r>
+              <w:rPr>
+                <w:b/>
+              </w:rPr>
+              <w:t>Module</w:t>
+            </w:r>
+          </w:p>
+        </w:tc>
+        <w:tc>
+          <w:tcPr>
+            <w:tcW w:type="dxa" w:w="6912"/>
+          </w:tcPr>
+          <w:p>
+            <w:r>
+              <w:rPr>
+                <w:b w:val="0"/>
+              </w:rPr>
+              <w:t>Purchase Orders</w:t>
+            </w:r>
+          </w:p>
+        </w:tc>
+      </w:tr>
+      <w:tr>
+        <w:tc>
+          <w:tcPr>
+            <w:tcW w:type="dxa" w:w="2016"/>
+          </w:tcPr>
+          <w:p>
+            <w:r>
+              <w:rPr>
+                <w:b/>
+              </w:rPr>
+              <w:t>Severity</w:t>
+            </w:r>
+          </w:p>
+        </w:tc>
+        <w:tc>
+          <w:tcPr>
+            <w:tcW w:type="dxa" w:w="6912"/>
+          </w:tcPr>
+          <w:p>
+            <w:r>
+              <w:rPr>
+                <w:b w:val="0"/>
+              </w:rPr>
+              <w:t>Minor</w:t>
+            </w:r>
+          </w:p>
+        </w:tc>
+      </w:tr>
+      <w:tr>
+        <w:tc>
+          <w:tcPr>
+            <w:tcW w:type="dxa" w:w="2016"/>
+          </w:tcPr>
+          <w:p>
+            <w:r>
+              <w:rPr>
+                <w:b/>
+              </w:rPr>
+              <w:t>Priority</w:t>
+            </w:r>
+          </w:p>
+        </w:tc>
+        <w:tc>
+          <w:tcPr>
+            <w:tcW w:type="dxa" w:w="6912"/>
+          </w:tcPr>
+          <w:p>
+            <w:r>
+              <w:rPr>
+                <w:b w:val="0"/>
+              </w:rPr>
+              <w:t>Medium</w:t>
+            </w:r>
+          </w:p>
+        </w:tc>
+      </w:tr>
+      <w:tr>
+        <w:tc>
+          <w:tcPr>
+            <w:tcW w:type="dxa" w:w="2016"/>
+          </w:tcPr>
+          <w:p>
+            <w:r>
+              <w:rPr>
+                <w:b/>
+              </w:rPr>
+              <w:t>Status</w:t>
+            </w:r>
+          </w:p>
+        </w:tc>
+        <w:tc>
+          <w:tcPr>
+            <w:tcW w:type="dxa" w:w="6912"/>
+          </w:tcPr>
+          <w:p>
+            <w:r>
+              <w:rPr>
+                <w:b w:val="0"/>
+              </w:rPr>
+              <w:t>Open</w:t>
+            </w:r>
+          </w:p>
+        </w:tc>
+      </w:tr>
+      <w:tr>
+        <w:tc>
+          <w:tcPr>
+            <w:tcW w:type="dxa" w:w="2016"/>
+          </w:tcPr>
+          <w:p>
+            <w:r>
+              <w:rPr>
+                <w:b/>
+              </w:rPr>
+              <w:t>Steps</w:t>
+            </w:r>
+          </w:p>
+        </w:tc>
+        <w:tc>
+          <w:tcPr>
+            <w:tcW w:type="dxa" w:w="6912"/>
+          </w:tcPr>
+          <w:p>
+            <w:r>
+              <w:rPr>
+                <w:b w:val="0"/>
+              </w:rPr>
+              <w:t>1. Go to Purchase Orders.</w:t>
+            </w:r>
+          </w:p>
+          <w:p>
+            <w:r>
+              <w:rPr>
+                <w:b w:val="0"/>
+              </w:rPr>
+              <w:t>2. Type PO-000002 in the search box.</w:t>
+            </w:r>
+          </w:p>
+        </w:tc>
+      </w:tr>
+      <w:tr>
+        <w:tc>
+          <w:tcPr>
+            <w:tcW w:type="dxa" w:w="2016"/>
+          </w:tcPr>
+          <w:p>
+            <w:r>
+              <w:rPr>
+                <w:b/>
+              </w:rPr>
+              <w:t>Expected Result</w:t>
+            </w:r>
+          </w:p>
+        </w:tc>
+        <w:tc>
+          <w:tcPr>
+            <w:tcW w:type="dxa" w:w="6912"/>
+          </w:tcPr>
+          <w:p>
+            <w:r>
+              <w:rPr>
+                <w:b w:val="0"/>
+              </w:rPr>
+              <w:t>PO-000002 is shown in the list.</w:t>
+            </w:r>
+          </w:p>
+        </w:tc>
+      </w:tr>
+      <w:tr>
+        <w:tc>
+          <w:tcPr>
+            <w:tcW w:type="dxa" w:w="2016"/>
+          </w:tcPr>
+          <w:p>
+            <w:r>
+              <w:rPr>
+                <w:b/>
+              </w:rPr>
+              <w:t>Actual Result</w:t>
+            </w:r>
+          </w:p>
+        </w:tc>
+        <w:tc>
+          <w:tcPr>
+            <w:tcW w:type="dxa" w:w="6912"/>
+          </w:tcPr>
+          <w:p>
+            <w:r>
+              <w:rPr>
+                <w:b w:val="0"/>
+              </w:rPr>
+              <w:t>"No purchase orders found." Search works only in small letters (po-000002).</w:t>
+            </w:r>
+          </w:p>
+        </w:tc>
+      </w:tr>
+      <w:tr>
+        <w:tc>
+          <w:tcPr>
+            <w:tcW w:type="dxa" w:w="2016"/>
+          </w:tcPr>
+          <w:p>
+            <w:r>
+              <w:rPr>
+                <w:b/>
+              </w:rPr>
+              <w:t>File / Line</w:t>
+            </w:r>
+          </w:p>
+        </w:tc>
+        <w:tc>
+          <w:tcPr>
+            <w:tcW w:type="dxa" w:w="6912"/>
+          </w:tcPr>
+          <w:p>
+            <w:r>
+              <w:rPr>
+                <w:b w:val="0"/>
+              </w:rPr>
+              <w:t>src/pages/PurchaseOrders.jsx : 115</w:t>
+            </w:r>
+          </w:p>
+        </w:tc>
+      </w:tr>
+      <w:tr>
+        <w:tc>
+          <w:tcPr>
+            <w:tcW w:type="dxa" w:w="2016"/>
+          </w:tcPr>
+          <w:p>
+            <w:r>
+              <w:rPr>
+                <w:b/>
+              </w:rPr>
+              <w:t>Root Cause</w:t>
+            </w:r>
+          </w:p>
+        </w:tc>
+        <w:tc>
+          <w:tcPr>
+            <w:tcW w:type="dxa" w:w="6912"/>
+          </w:tcPr>
+          <w:p>
+            <w:r>
+              <w:rPr>
+                <w:b w:val="0"/>
+              </w:rPr>
+              <w:t>Search text is not converted to lower case: (po.poNumber || '').toLowerCase().includes(searchTerm)</w:t>
+            </w:r>
+          </w:p>
+        </w:tc>
+      </w:tr>
+    </w:tbl>
     <w:p>
       <w:pPr>
-        <w:pStyle w:val="Heading1"/>
+        <w:keepNext/>
+        <w:spacing w:before="160"/>
       </w:pPr>
-      <w:r>
-        <w:t>BUG-01: Purchase order search does not find a PO when you type capital letters</w:t>
-      </w:r>
-    </w:p>
-    <w:p>
       <w:r>
         <w:rPr>
           <w:b/>
         </w:rPr>
-        <w:t xml:space="preserve">Page: </w:t>
-      </w:r>
-      <w:r>
-        <w:t>Purchase Orders  (/inventory/purchase-orders)</w:t>
-      </w:r>
-    </w:p>
-    <w:p>
-      <w:r>
-        <w:rPr>
-          <w:b/>
-        </w:rPr>
-        <w:t xml:space="preserve">Severity: </w:t>
-      </w:r>
-      <w:r>
-        <w:t>Minor</w:t>
-      </w:r>
-    </w:p>
-    <w:p>
-      <w:r>
-        <w:rPr>
-          <w:b/>
-        </w:rPr>
-        <w:t xml:space="preserve">Result: </w:t>
-      </w:r>
-      <w:r>
-        <w:rPr>
-          <w:b/>
-          <w:color w:val="B91C1C"/>
-        </w:rPr>
-        <w:t>FAIL</w:t>
-      </w:r>
-    </w:p>
-    <w:p>
-      <w:pPr>
-        <w:pStyle w:val="Heading2"/>
-      </w:pPr>
-      <w:r>
-        <w:t>Steps to see it</w:t>
-      </w:r>
-    </w:p>
-    <w:p>
-      <w:pPr>
-        <w:pStyle w:val="ListNumber"/>
-      </w:pPr>
-      <w:r>
-        <w:t>Open Purchase Orders.</w:t>
-      </w:r>
-    </w:p>
-    <w:p>
-      <w:pPr>
-        <w:pStyle w:val="ListNumber"/>
-      </w:pPr>
-      <w:r>
-        <w:t>In the search box type: PO-000002</w:t>
-      </w:r>
-    </w:p>
-    <w:p>
-      <w:pPr>
-        <w:pStyle w:val="Heading2"/>
-      </w:pPr>
-      <w:r>
-        <w:t>Expected output</w:t>
-      </w:r>
-    </w:p>
-    <w:p>
-      <w:r>
-        <w:t>The order PO-000002 shows in the list.</w:t>
+        <w:t>Expected:</w:t>
       </w:r>
     </w:p>
     <w:p>
       <w:r>
         <w:drawing>
           <wp:inline xmlns:a="http://schemas.openxmlformats.org/drawingml/2006/main" xmlns:pic="http://schemas.openxmlformats.org/drawingml/2006/picture">
-            <wp:extent cx="5669280" cy="3735250"/>
+            <wp:extent cx="3931920" cy="2590577"/>
             <wp:docPr id="1" name="Picture 1"/>
             <wp:cNvGraphicFramePr>
               <a:graphicFrameLocks noChangeAspect="1"/>
@@ -636,7 +1178,7 @@
                   <pic:spPr>
                     <a:xfrm>
                       <a:off x="0" y="0"/>
-                      <a:ext cx="5669280" cy="3735250"/>
+                      <a:ext cx="3931920" cy="2590577"/>
                     </a:xfrm>
                     <a:prstGeom prst="rect"/>
                   </pic:spPr>
@@ -648,31 +1190,22 @@
       </w:r>
     </w:p>
     <w:p>
+      <w:pPr>
+        <w:keepNext/>
+        <w:spacing w:before="160"/>
+      </w:pPr>
       <w:r>
         <w:rPr>
-          <w:i/>
+          <w:b/>
         </w:rPr>
-        <w:t>Screenshot: main app (correct)</w:t>
-      </w:r>
-    </w:p>
-    <w:p>
-      <w:pPr>
-        <w:pStyle w:val="Heading2"/>
-      </w:pPr>
-      <w:r>
-        <w:t>Actual output (coming output)</w:t>
-      </w:r>
-    </w:p>
-    <w:p>
-      <w:r>
-        <w:t>The list says "No purchase orders found." Typing po-000002 in small letters works, so the search only works in small letters.</w:t>
+        <w:t>Actual:</w:t>
       </w:r>
     </w:p>
     <w:p>
       <w:r>
         <w:drawing>
           <wp:inline xmlns:a="http://schemas.openxmlformats.org/drawingml/2006/main" xmlns:pic="http://schemas.openxmlformats.org/drawingml/2006/picture">
-            <wp:extent cx="5669280" cy="3735250"/>
+            <wp:extent cx="3931920" cy="2590577"/>
             <wp:docPr id="2" name="Picture 2"/>
             <wp:cNvGraphicFramePr>
               <a:graphicFrameLocks noChangeAspect="1"/>
@@ -693,7 +1226,7 @@
                   <pic:spPr>
                     <a:xfrm>
                       <a:off x="0" y="0"/>
-                      <a:ext cx="5669280" cy="3735250"/>
+                      <a:ext cx="3931920" cy="2590577"/>
                     </a:xfrm>
                     <a:prstGeom prst="rect"/>
                   </pic:spPr>
@@ -705,157 +1238,302 @@
       </w:r>
     </w:p>
     <w:p>
+      <w:pPr>
+        <w:pStyle w:val="Heading1"/>
+        <w:pageBreakBefore/>
+      </w:pPr>
       <w:r>
-        <w:rPr>
-          <w:i/>
-        </w:rPr>
-        <w:t>Screenshot: bug branch (wrong)</w:t>
+        <w:t>BUG-02 - Supplier search does not find supplier by name</w:t>
       </w:r>
     </w:p>
+    <w:tbl>
+      <w:tblPr>
+        <w:tblStyle w:val="TableGrid"/>
+        <w:tblW w:type="auto" w:w="0"/>
+        <w:tblLook w:firstColumn="1" w:firstRow="1" w:lastColumn="0" w:lastRow="0" w:noHBand="0" w:noVBand="1" w:val="04A0"/>
+      </w:tblPr>
+      <w:tblGrid>
+        <w:gridCol w:w="4320"/>
+        <w:gridCol w:w="4320"/>
+      </w:tblGrid>
+      <w:tr>
+        <w:tc>
+          <w:tcPr>
+            <w:tcW w:type="dxa" w:w="2016"/>
+          </w:tcPr>
+          <w:p>
+            <w:r>
+              <w:rPr>
+                <w:b/>
+              </w:rPr>
+              <w:t>Module</w:t>
+            </w:r>
+          </w:p>
+        </w:tc>
+        <w:tc>
+          <w:tcPr>
+            <w:tcW w:type="dxa" w:w="6912"/>
+          </w:tcPr>
+          <w:p>
+            <w:r>
+              <w:rPr>
+                <w:b w:val="0"/>
+              </w:rPr>
+              <w:t>Suppliers</w:t>
+            </w:r>
+          </w:p>
+        </w:tc>
+      </w:tr>
+      <w:tr>
+        <w:tc>
+          <w:tcPr>
+            <w:tcW w:type="dxa" w:w="2016"/>
+          </w:tcPr>
+          <w:p>
+            <w:r>
+              <w:rPr>
+                <w:b/>
+              </w:rPr>
+              <w:t>Severity</w:t>
+            </w:r>
+          </w:p>
+        </w:tc>
+        <w:tc>
+          <w:tcPr>
+            <w:tcW w:type="dxa" w:w="6912"/>
+          </w:tcPr>
+          <w:p>
+            <w:r>
+              <w:rPr>
+                <w:b w:val="0"/>
+              </w:rPr>
+              <w:t>Minor</w:t>
+            </w:r>
+          </w:p>
+        </w:tc>
+      </w:tr>
+      <w:tr>
+        <w:tc>
+          <w:tcPr>
+            <w:tcW w:type="dxa" w:w="2016"/>
+          </w:tcPr>
+          <w:p>
+            <w:r>
+              <w:rPr>
+                <w:b/>
+              </w:rPr>
+              <w:t>Priority</w:t>
+            </w:r>
+          </w:p>
+        </w:tc>
+        <w:tc>
+          <w:tcPr>
+            <w:tcW w:type="dxa" w:w="6912"/>
+          </w:tcPr>
+          <w:p>
+            <w:r>
+              <w:rPr>
+                <w:b w:val="0"/>
+              </w:rPr>
+              <w:t>Medium</w:t>
+            </w:r>
+          </w:p>
+        </w:tc>
+      </w:tr>
+      <w:tr>
+        <w:tc>
+          <w:tcPr>
+            <w:tcW w:type="dxa" w:w="2016"/>
+          </w:tcPr>
+          <w:p>
+            <w:r>
+              <w:rPr>
+                <w:b/>
+              </w:rPr>
+              <w:t>Status</w:t>
+            </w:r>
+          </w:p>
+        </w:tc>
+        <w:tc>
+          <w:tcPr>
+            <w:tcW w:type="dxa" w:w="6912"/>
+          </w:tcPr>
+          <w:p>
+            <w:r>
+              <w:rPr>
+                <w:b w:val="0"/>
+              </w:rPr>
+              <w:t>Open</w:t>
+            </w:r>
+          </w:p>
+        </w:tc>
+      </w:tr>
+      <w:tr>
+        <w:tc>
+          <w:tcPr>
+            <w:tcW w:type="dxa" w:w="2016"/>
+          </w:tcPr>
+          <w:p>
+            <w:r>
+              <w:rPr>
+                <w:b/>
+              </w:rPr>
+              <w:t>Steps</w:t>
+            </w:r>
+          </w:p>
+        </w:tc>
+        <w:tc>
+          <w:tcPr>
+            <w:tcW w:type="dxa" w:w="6912"/>
+          </w:tcPr>
+          <w:p>
+            <w:r>
+              <w:rPr>
+                <w:b w:val="0"/>
+              </w:rPr>
+              <w:t>1. Go to Purchase Orders &gt; Suppliers.</w:t>
+            </w:r>
+          </w:p>
+          <w:p>
+            <w:r>
+              <w:rPr>
+                <w:b w:val="0"/>
+              </w:rPr>
+              <w:t>2. Type Kanchi in the search box.</w:t>
+            </w:r>
+          </w:p>
+        </w:tc>
+      </w:tr>
+      <w:tr>
+        <w:tc>
+          <w:tcPr>
+            <w:tcW w:type="dxa" w:w="2016"/>
+          </w:tcPr>
+          <w:p>
+            <w:r>
+              <w:rPr>
+                <w:b/>
+              </w:rPr>
+              <w:t>Expected Result</w:t>
+            </w:r>
+          </w:p>
+        </w:tc>
+        <w:tc>
+          <w:tcPr>
+            <w:tcW w:type="dxa" w:w="6912"/>
+          </w:tcPr>
+          <w:p>
+            <w:r>
+              <w:rPr>
+                <w:b w:val="0"/>
+              </w:rPr>
+              <w:t>Kanchi Weavers is shown.</w:t>
+            </w:r>
+          </w:p>
+        </w:tc>
+      </w:tr>
+      <w:tr>
+        <w:tc>
+          <w:tcPr>
+            <w:tcW w:type="dxa" w:w="2016"/>
+          </w:tcPr>
+          <w:p>
+            <w:r>
+              <w:rPr>
+                <w:b/>
+              </w:rPr>
+              <w:t>Actual Result</w:t>
+            </w:r>
+          </w:p>
+        </w:tc>
+        <w:tc>
+          <w:tcPr>
+            <w:tcW w:type="dxa" w:w="6912"/>
+          </w:tcPr>
+          <w:p>
+            <w:r>
+              <w:rPr>
+                <w:b w:val="0"/>
+              </w:rPr>
+              <w:t>"No suppliers found." Search by supplier code still works.</w:t>
+            </w:r>
+          </w:p>
+        </w:tc>
+      </w:tr>
+      <w:tr>
+        <w:tc>
+          <w:tcPr>
+            <w:tcW w:type="dxa" w:w="2016"/>
+          </w:tcPr>
+          <w:p>
+            <w:r>
+              <w:rPr>
+                <w:b/>
+              </w:rPr>
+              <w:t>File / Line</w:t>
+            </w:r>
+          </w:p>
+        </w:tc>
+        <w:tc>
+          <w:tcPr>
+            <w:tcW w:type="dxa" w:w="6912"/>
+          </w:tcPr>
+          <w:p>
+            <w:r>
+              <w:rPr>
+                <w:b w:val="0"/>
+              </w:rPr>
+              <w:t>src/pages/Suppliers.jsx : 25</w:t>
+            </w:r>
+          </w:p>
+        </w:tc>
+      </w:tr>
+      <w:tr>
+        <w:tc>
+          <w:tcPr>
+            <w:tcW w:type="dxa" w:w="2016"/>
+          </w:tcPr>
+          <w:p>
+            <w:r>
+              <w:rPr>
+                <w:b/>
+              </w:rPr>
+              <w:t>Root Cause</w:t>
+            </w:r>
+          </w:p>
+        </w:tc>
+        <w:tc>
+          <w:tcPr>
+            <w:tcW w:type="dxa" w:w="6912"/>
+          </w:tcPr>
+          <w:p>
+            <w:r>
+              <w:rPr>
+                <w:b w:val="0"/>
+              </w:rPr>
+              <w:t>Supplier name is not converted to lower case: (s.name || '').includes(searchTerm.toLowerCase())</w:t>
+            </w:r>
+          </w:p>
+        </w:tc>
+      </w:tr>
+    </w:tbl>
     <w:p>
       <w:pPr>
-        <w:pStyle w:val="Heading2"/>
+        <w:keepNext/>
+        <w:spacing w:before="160"/>
       </w:pPr>
-      <w:r>
-        <w:t>Where the system breaks</w:t>
-      </w:r>
-    </w:p>
-    <w:p>
-      <w:pPr>
-        <w:pStyle w:val="ListBullet"/>
-      </w:pPr>
-      <w:r>
-        <w:t>File: src/pages/PurchaseOrders.jsx, line 115</w:t>
-      </w:r>
-    </w:p>
-    <w:p>
-      <w:pPr>
-        <w:pStyle w:val="ListBullet"/>
-      </w:pPr>
-      <w:r>
-        <w:t xml:space="preserve">Wrong code (now): </w:t>
-      </w:r>
-      <w:r>
-        <w:rPr>
-          <w:rFonts w:ascii="Consolas" w:hAnsi="Consolas"/>
-        </w:rPr>
-        <w:t>(po.poNumber || '').toLowerCase().includes(searchTerm)</w:t>
-      </w:r>
-    </w:p>
-    <w:p>
-      <w:pPr>
-        <w:pStyle w:val="ListBullet"/>
-      </w:pPr>
-      <w:r>
-        <w:t xml:space="preserve">Right code: </w:t>
-      </w:r>
-      <w:r>
-        <w:rPr>
-          <w:rFonts w:ascii="Consolas" w:hAnsi="Consolas"/>
-        </w:rPr>
-        <w:t>(po.poNumber || '').toLowerCase().includes(searchTerm.toLowerCase())</w:t>
-      </w:r>
-    </w:p>
-    <w:p>
-      <w:pPr>
-        <w:pStyle w:val="ListBullet"/>
-      </w:pPr>
-      <w:r>
-        <w:t>Why: The PO number is changed to small letters, but what you typed is not. "po-000002" never contains "PO-000002".</w:t>
-      </w:r>
-    </w:p>
-    <w:p>
-      <w:r>
-        <w:br w:type="page"/>
-      </w:r>
-    </w:p>
-    <w:p>
-      <w:pPr>
-        <w:pStyle w:val="Heading1"/>
-      </w:pPr>
-      <w:r>
-        <w:t>BUG-02: Supplier search does not find a supplier by name</w:t>
-      </w:r>
-    </w:p>
-    <w:p>
       <w:r>
         <w:rPr>
           <w:b/>
         </w:rPr>
-        <w:t xml:space="preserve">Page: </w:t>
-      </w:r>
-      <w:r>
-        <w:t>Suppliers  (/inventory/suppliers)</w:t>
-      </w:r>
-    </w:p>
-    <w:p>
-      <w:r>
-        <w:rPr>
-          <w:b/>
-        </w:rPr>
-        <w:t xml:space="preserve">Severity: </w:t>
-      </w:r>
-      <w:r>
-        <w:t>Minor</w:t>
-      </w:r>
-    </w:p>
-    <w:p>
-      <w:r>
-        <w:rPr>
-          <w:b/>
-        </w:rPr>
-        <w:t xml:space="preserve">Result: </w:t>
-      </w:r>
-      <w:r>
-        <w:rPr>
-          <w:b/>
-          <w:color w:val="B91C1C"/>
-        </w:rPr>
-        <w:t>FAIL</w:t>
-      </w:r>
-    </w:p>
-    <w:p>
-      <w:pPr>
-        <w:pStyle w:val="Heading2"/>
-      </w:pPr>
-      <w:r>
-        <w:t>Steps to see it</w:t>
-      </w:r>
-    </w:p>
-    <w:p>
-      <w:pPr>
-        <w:pStyle w:val="ListNumber"/>
-      </w:pPr>
-      <w:r>
-        <w:t>Open Purchase Orders, then the Suppliers tab.</w:t>
-      </w:r>
-    </w:p>
-    <w:p>
-      <w:pPr>
-        <w:pStyle w:val="ListNumber"/>
-      </w:pPr>
-      <w:r>
-        <w:t>In the search box type: Kanchi</w:t>
-      </w:r>
-    </w:p>
-    <w:p>
-      <w:pPr>
-        <w:pStyle w:val="Heading2"/>
-      </w:pPr>
-      <w:r>
-        <w:t>Expected output</w:t>
-      </w:r>
-    </w:p>
-    <w:p>
-      <w:r>
-        <w:t>The supplier "Kanchi Weavers" shows in the list.</w:t>
+        <w:t>Expected:</w:t>
       </w:r>
     </w:p>
     <w:p>
       <w:r>
         <w:drawing>
           <wp:inline xmlns:a="http://schemas.openxmlformats.org/drawingml/2006/main" xmlns:pic="http://schemas.openxmlformats.org/drawingml/2006/picture">
-            <wp:extent cx="5669280" cy="3735250"/>
+            <wp:extent cx="3931920" cy="2590577"/>
             <wp:docPr id="3" name="Picture 3"/>
             <wp:cNvGraphicFramePr>
               <a:graphicFrameLocks noChangeAspect="1"/>
@@ -876,7 +1554,7 @@
                   <pic:spPr>
                     <a:xfrm>
                       <a:off x="0" y="0"/>
-                      <a:ext cx="5669280" cy="3735250"/>
+                      <a:ext cx="3931920" cy="2590577"/>
                     </a:xfrm>
                     <a:prstGeom prst="rect"/>
                   </pic:spPr>
@@ -888,31 +1566,22 @@
       </w:r>
     </w:p>
     <w:p>
+      <w:pPr>
+        <w:keepNext/>
+        <w:spacing w:before="160"/>
+      </w:pPr>
       <w:r>
         <w:rPr>
-          <w:i/>
+          <w:b/>
         </w:rPr>
-        <w:t>Screenshot: main app (correct)</w:t>
-      </w:r>
-    </w:p>
-    <w:p>
-      <w:pPr>
-        <w:pStyle w:val="Heading2"/>
-      </w:pPr>
-      <w:r>
-        <w:t>Actual output (coming output)</w:t>
-      </w:r>
-    </w:p>
-    <w:p>
-      <w:r>
-        <w:t>The list says "No suppliers found." Search by supplier code still works.</w:t>
+        <w:t>Actual:</w:t>
       </w:r>
     </w:p>
     <w:p>
       <w:r>
         <w:drawing>
           <wp:inline xmlns:a="http://schemas.openxmlformats.org/drawingml/2006/main" xmlns:pic="http://schemas.openxmlformats.org/drawingml/2006/picture">
-            <wp:extent cx="5669280" cy="3735250"/>
+            <wp:extent cx="3931920" cy="2590577"/>
             <wp:docPr id="4" name="Picture 4"/>
             <wp:cNvGraphicFramePr>
               <a:graphicFrameLocks noChangeAspect="1"/>
@@ -933,7 +1602,7 @@
                   <pic:spPr>
                     <a:xfrm>
                       <a:off x="0" y="0"/>
-                      <a:ext cx="5669280" cy="3735250"/>
+                      <a:ext cx="3931920" cy="2590577"/>
                     </a:xfrm>
                     <a:prstGeom prst="rect"/>
                   </pic:spPr>
@@ -945,157 +1614,302 @@
       </w:r>
     </w:p>
     <w:p>
+      <w:pPr>
+        <w:pStyle w:val="Heading1"/>
+        <w:pageBreakBefore/>
+      </w:pPr>
       <w:r>
-        <w:rPr>
-          <w:i/>
-        </w:rPr>
-        <w:t>Screenshot: bug branch (wrong)</w:t>
+        <w:t>BUG-03 - Out of Stock tab shows -1</w:t>
       </w:r>
     </w:p>
+    <w:tbl>
+      <w:tblPr>
+        <w:tblStyle w:val="TableGrid"/>
+        <w:tblW w:type="auto" w:w="0"/>
+        <w:tblLook w:firstColumn="1" w:firstRow="1" w:lastColumn="0" w:lastRow="0" w:noHBand="0" w:noVBand="1" w:val="04A0"/>
+      </w:tblPr>
+      <w:tblGrid>
+        <w:gridCol w:w="4320"/>
+        <w:gridCol w:w="4320"/>
+      </w:tblGrid>
+      <w:tr>
+        <w:tc>
+          <w:tcPr>
+            <w:tcW w:type="dxa" w:w="2016"/>
+          </w:tcPr>
+          <w:p>
+            <w:r>
+              <w:rPr>
+                <w:b/>
+              </w:rPr>
+              <w:t>Module</w:t>
+            </w:r>
+          </w:p>
+        </w:tc>
+        <w:tc>
+          <w:tcPr>
+            <w:tcW w:type="dxa" w:w="6912"/>
+          </w:tcPr>
+          <w:p>
+            <w:r>
+              <w:rPr>
+                <w:b w:val="0"/>
+              </w:rPr>
+              <w:t>Stock Alerts</w:t>
+            </w:r>
+          </w:p>
+        </w:tc>
+      </w:tr>
+      <w:tr>
+        <w:tc>
+          <w:tcPr>
+            <w:tcW w:type="dxa" w:w="2016"/>
+          </w:tcPr>
+          <w:p>
+            <w:r>
+              <w:rPr>
+                <w:b/>
+              </w:rPr>
+              <w:t>Severity</w:t>
+            </w:r>
+          </w:p>
+        </w:tc>
+        <w:tc>
+          <w:tcPr>
+            <w:tcW w:type="dxa" w:w="6912"/>
+          </w:tcPr>
+          <w:p>
+            <w:r>
+              <w:rPr>
+                <w:b w:val="0"/>
+              </w:rPr>
+              <w:t>Minor</w:t>
+            </w:r>
+          </w:p>
+        </w:tc>
+      </w:tr>
+      <w:tr>
+        <w:tc>
+          <w:tcPr>
+            <w:tcW w:type="dxa" w:w="2016"/>
+          </w:tcPr>
+          <w:p>
+            <w:r>
+              <w:rPr>
+                <w:b/>
+              </w:rPr>
+              <w:t>Priority</w:t>
+            </w:r>
+          </w:p>
+        </w:tc>
+        <w:tc>
+          <w:tcPr>
+            <w:tcW w:type="dxa" w:w="6912"/>
+          </w:tcPr>
+          <w:p>
+            <w:r>
+              <w:rPr>
+                <w:b w:val="0"/>
+              </w:rPr>
+              <w:t>Low</w:t>
+            </w:r>
+          </w:p>
+        </w:tc>
+      </w:tr>
+      <w:tr>
+        <w:tc>
+          <w:tcPr>
+            <w:tcW w:type="dxa" w:w="2016"/>
+          </w:tcPr>
+          <w:p>
+            <w:r>
+              <w:rPr>
+                <w:b/>
+              </w:rPr>
+              <w:t>Status</w:t>
+            </w:r>
+          </w:p>
+        </w:tc>
+        <w:tc>
+          <w:tcPr>
+            <w:tcW w:type="dxa" w:w="6912"/>
+          </w:tcPr>
+          <w:p>
+            <w:r>
+              <w:rPr>
+                <w:b w:val="0"/>
+              </w:rPr>
+              <w:t>Open</w:t>
+            </w:r>
+          </w:p>
+        </w:tc>
+      </w:tr>
+      <w:tr>
+        <w:tc>
+          <w:tcPr>
+            <w:tcW w:type="dxa" w:w="2016"/>
+          </w:tcPr>
+          <w:p>
+            <w:r>
+              <w:rPr>
+                <w:b/>
+              </w:rPr>
+              <w:t>Steps</w:t>
+            </w:r>
+          </w:p>
+        </w:tc>
+        <w:tc>
+          <w:tcPr>
+            <w:tcW w:type="dxa" w:w="6912"/>
+          </w:tcPr>
+          <w:p>
+            <w:r>
+              <w:rPr>
+                <w:b w:val="0"/>
+              </w:rPr>
+              <w:t>1. Go to Inventory &gt; Stock alerts.</w:t>
+            </w:r>
+          </w:p>
+          <w:p>
+            <w:r>
+              <w:rPr>
+                <w:b w:val="0"/>
+              </w:rPr>
+              <w:t>2. Check the Out of Stock tab count.</w:t>
+            </w:r>
+          </w:p>
+        </w:tc>
+      </w:tr>
+      <w:tr>
+        <w:tc>
+          <w:tcPr>
+            <w:tcW w:type="dxa" w:w="2016"/>
+          </w:tcPr>
+          <w:p>
+            <w:r>
+              <w:rPr>
+                <w:b/>
+              </w:rPr>
+              <w:t>Expected Result</w:t>
+            </w:r>
+          </w:p>
+        </w:tc>
+        <w:tc>
+          <w:tcPr>
+            <w:tcW w:type="dxa" w:w="6912"/>
+          </w:tcPr>
+          <w:p>
+            <w:r>
+              <w:rPr>
+                <w:b w:val="0"/>
+              </w:rPr>
+              <w:t>Out of Stock (0)</w:t>
+            </w:r>
+          </w:p>
+        </w:tc>
+      </w:tr>
+      <w:tr>
+        <w:tc>
+          <w:tcPr>
+            <w:tcW w:type="dxa" w:w="2016"/>
+          </w:tcPr>
+          <w:p>
+            <w:r>
+              <w:rPr>
+                <w:b/>
+              </w:rPr>
+              <w:t>Actual Result</w:t>
+            </w:r>
+          </w:p>
+        </w:tc>
+        <w:tc>
+          <w:tcPr>
+            <w:tcW w:type="dxa" w:w="6912"/>
+          </w:tcPr>
+          <w:p>
+            <w:r>
+              <w:rPr>
+                <w:b w:val="0"/>
+              </w:rPr>
+              <w:t>Out of Stock (-1). Count is always one less than the rows.</w:t>
+            </w:r>
+          </w:p>
+        </w:tc>
+      </w:tr>
+      <w:tr>
+        <w:tc>
+          <w:tcPr>
+            <w:tcW w:type="dxa" w:w="2016"/>
+          </w:tcPr>
+          <w:p>
+            <w:r>
+              <w:rPr>
+                <w:b/>
+              </w:rPr>
+              <w:t>File / Line</w:t>
+            </w:r>
+          </w:p>
+        </w:tc>
+        <w:tc>
+          <w:tcPr>
+            <w:tcW w:type="dxa" w:w="6912"/>
+          </w:tcPr>
+          <w:p>
+            <w:r>
+              <w:rPr>
+                <w:b w:val="0"/>
+              </w:rPr>
+              <w:t>src/pages/AlertCenter.jsx : 96</w:t>
+            </w:r>
+          </w:p>
+        </w:tc>
+      </w:tr>
+      <w:tr>
+        <w:tc>
+          <w:tcPr>
+            <w:tcW w:type="dxa" w:w="2016"/>
+          </w:tcPr>
+          <w:p>
+            <w:r>
+              <w:rPr>
+                <w:b/>
+              </w:rPr>
+              <w:t>Root Cause</w:t>
+            </w:r>
+          </w:p>
+        </w:tc>
+        <w:tc>
+          <w:tcPr>
+            <w:tcW w:type="dxa" w:w="6912"/>
+          </w:tcPr>
+          <w:p>
+            <w:r>
+              <w:rPr>
+                <w:b w:val="0"/>
+              </w:rPr>
+              <w:t>Count is shown as outOfStock.length - 1</w:t>
+            </w:r>
+          </w:p>
+        </w:tc>
+      </w:tr>
+    </w:tbl>
     <w:p>
       <w:pPr>
-        <w:pStyle w:val="Heading2"/>
+        <w:keepNext/>
+        <w:spacing w:before="160"/>
       </w:pPr>
-      <w:r>
-        <w:t>Where the system breaks</w:t>
-      </w:r>
-    </w:p>
-    <w:p>
-      <w:pPr>
-        <w:pStyle w:val="ListBullet"/>
-      </w:pPr>
-      <w:r>
-        <w:t>File: src/pages/Suppliers.jsx, line 25</w:t>
-      </w:r>
-    </w:p>
-    <w:p>
-      <w:pPr>
-        <w:pStyle w:val="ListBullet"/>
-      </w:pPr>
-      <w:r>
-        <w:t xml:space="preserve">Wrong code (now): </w:t>
-      </w:r>
-      <w:r>
-        <w:rPr>
-          <w:rFonts w:ascii="Consolas" w:hAnsi="Consolas"/>
-        </w:rPr>
-        <w:t>(s.name || '').includes(searchTerm.toLowerCase())</w:t>
-      </w:r>
-    </w:p>
-    <w:p>
-      <w:pPr>
-        <w:pStyle w:val="ListBullet"/>
-      </w:pPr>
-      <w:r>
-        <w:t xml:space="preserve">Right code: </w:t>
-      </w:r>
-      <w:r>
-        <w:rPr>
-          <w:rFonts w:ascii="Consolas" w:hAnsi="Consolas"/>
-        </w:rPr>
-        <w:t>(s.name || '').toLowerCase().includes(searchTerm.toLowerCase())</w:t>
-      </w:r>
-    </w:p>
-    <w:p>
-      <w:pPr>
-        <w:pStyle w:val="ListBullet"/>
-      </w:pPr>
-      <w:r>
-        <w:t>Why: What you typed is changed to small letters ("kanchi"), but the name is not ("Kanchi Weavers"), so they never match.</w:t>
-      </w:r>
-    </w:p>
-    <w:p>
-      <w:r>
-        <w:br w:type="page"/>
-      </w:r>
-    </w:p>
-    <w:p>
-      <w:pPr>
-        <w:pStyle w:val="Heading1"/>
-      </w:pPr>
-      <w:r>
-        <w:t>BUG-03: The "Out of Stock" tab shows a count of -1</w:t>
-      </w:r>
-    </w:p>
-    <w:p>
       <w:r>
         <w:rPr>
           <w:b/>
         </w:rPr>
-        <w:t xml:space="preserve">Page: </w:t>
-      </w:r>
-      <w:r>
-        <w:t>Stock alerts  (/inventory/alerts)</w:t>
-      </w:r>
-    </w:p>
-    <w:p>
-      <w:r>
-        <w:rPr>
-          <w:b/>
-        </w:rPr>
-        <w:t xml:space="preserve">Severity: </w:t>
-      </w:r>
-      <w:r>
-        <w:t>Minor</w:t>
-      </w:r>
-    </w:p>
-    <w:p>
-      <w:r>
-        <w:rPr>
-          <w:b/>
-        </w:rPr>
-        <w:t xml:space="preserve">Result: </w:t>
-      </w:r>
-      <w:r>
-        <w:rPr>
-          <w:b/>
-          <w:color w:val="B91C1C"/>
-        </w:rPr>
-        <w:t>FAIL</w:t>
-      </w:r>
-    </w:p>
-    <w:p>
-      <w:pPr>
-        <w:pStyle w:val="Heading2"/>
-      </w:pPr>
-      <w:r>
-        <w:t>Steps to see it</w:t>
-      </w:r>
-    </w:p>
-    <w:p>
-      <w:pPr>
-        <w:pStyle w:val="ListNumber"/>
-      </w:pPr>
-      <w:r>
-        <w:t>Open Inventory, then click "Stock alerts".</w:t>
-      </w:r>
-    </w:p>
-    <w:p>
-      <w:pPr>
-        <w:pStyle w:val="ListNumber"/>
-      </w:pPr>
-      <w:r>
-        <w:t>Look at the first tab name.</w:t>
-      </w:r>
-    </w:p>
-    <w:p>
-      <w:pPr>
-        <w:pStyle w:val="Heading2"/>
-      </w:pPr>
-      <w:r>
-        <w:t>Expected output</w:t>
-      </w:r>
-    </w:p>
-    <w:p>
-      <w:r>
-        <w:t>The tab says "Out of Stock (0)" -- the same as the number of rows in it.</w:t>
+        <w:t>Expected:</w:t>
       </w:r>
     </w:p>
     <w:p>
       <w:r>
         <w:drawing>
           <wp:inline xmlns:a="http://schemas.openxmlformats.org/drawingml/2006/main" xmlns:pic="http://schemas.openxmlformats.org/drawingml/2006/picture">
-            <wp:extent cx="5669280" cy="3735250"/>
+            <wp:extent cx="3931920" cy="2590577"/>
             <wp:docPr id="5" name="Picture 5"/>
             <wp:cNvGraphicFramePr>
               <a:graphicFrameLocks noChangeAspect="1"/>
@@ -1116,7 +1930,7 @@
                   <pic:spPr>
                     <a:xfrm>
                       <a:off x="0" y="0"/>
-                      <a:ext cx="5669280" cy="3735250"/>
+                      <a:ext cx="3931920" cy="2590577"/>
                     </a:xfrm>
                     <a:prstGeom prst="rect"/>
                   </pic:spPr>
@@ -1128,31 +1942,22 @@
       </w:r>
     </w:p>
     <w:p>
+      <w:pPr>
+        <w:keepNext/>
+        <w:spacing w:before="160"/>
+      </w:pPr>
       <w:r>
         <w:rPr>
-          <w:i/>
+          <w:b/>
         </w:rPr>
-        <w:t>Screenshot: main app (correct)</w:t>
-      </w:r>
-    </w:p>
-    <w:p>
-      <w:pPr>
-        <w:pStyle w:val="Heading2"/>
-      </w:pPr>
-      <w:r>
-        <w:t>Actual output (coming output)</w:t>
-      </w:r>
-    </w:p>
-    <w:p>
-      <w:r>
-        <w:t>The tab says "Out of Stock (-1)". The number is always one less than the real count, and a count can never be below 0.</w:t>
+        <w:t>Actual:</w:t>
       </w:r>
     </w:p>
     <w:p>
       <w:r>
         <w:drawing>
           <wp:inline xmlns:a="http://schemas.openxmlformats.org/drawingml/2006/main" xmlns:pic="http://schemas.openxmlformats.org/drawingml/2006/picture">
-            <wp:extent cx="5669280" cy="3735250"/>
+            <wp:extent cx="3931920" cy="2590577"/>
             <wp:docPr id="6" name="Picture 6"/>
             <wp:cNvGraphicFramePr>
               <a:graphicFrameLocks noChangeAspect="1"/>
@@ -1173,7 +1978,7 @@
                   <pic:spPr>
                     <a:xfrm>
                       <a:off x="0" y="0"/>
-                      <a:ext cx="5669280" cy="3735250"/>
+                      <a:ext cx="3931920" cy="2590577"/>
                     </a:xfrm>
                     <a:prstGeom prst="rect"/>
                   </pic:spPr>
@@ -1185,157 +1990,302 @@
       </w:r>
     </w:p>
     <w:p>
+      <w:pPr>
+        <w:pStyle w:val="Heading1"/>
+        <w:pageBreakBefore/>
+      </w:pPr>
       <w:r>
-        <w:rPr>
-          <w:i/>
-        </w:rPr>
-        <w:t>Screenshot: bug branch (wrong)</w:t>
+        <w:t>BUG-04 - Zero stock is not shown in red</w:t>
       </w:r>
     </w:p>
+    <w:tbl>
+      <w:tblPr>
+        <w:tblStyle w:val="TableGrid"/>
+        <w:tblW w:type="auto" w:w="0"/>
+        <w:tblLook w:firstColumn="1" w:firstRow="1" w:lastColumn="0" w:lastRow="0" w:noHBand="0" w:noVBand="1" w:val="04A0"/>
+      </w:tblPr>
+      <w:tblGrid>
+        <w:gridCol w:w="4320"/>
+        <w:gridCol w:w="4320"/>
+      </w:tblGrid>
+      <w:tr>
+        <w:tc>
+          <w:tcPr>
+            <w:tcW w:type="dxa" w:w="2016"/>
+          </w:tcPr>
+          <w:p>
+            <w:r>
+              <w:rPr>
+                <w:b/>
+              </w:rPr>
+              <w:t>Module</w:t>
+            </w:r>
+          </w:p>
+        </w:tc>
+        <w:tc>
+          <w:tcPr>
+            <w:tcW w:type="dxa" w:w="6912"/>
+          </w:tcPr>
+          <w:p>
+            <w:r>
+              <w:rPr>
+                <w:b w:val="0"/>
+              </w:rPr>
+              <w:t>Inventory</w:t>
+            </w:r>
+          </w:p>
+        </w:tc>
+      </w:tr>
+      <w:tr>
+        <w:tc>
+          <w:tcPr>
+            <w:tcW w:type="dxa" w:w="2016"/>
+          </w:tcPr>
+          <w:p>
+            <w:r>
+              <w:rPr>
+                <w:b/>
+              </w:rPr>
+              <w:t>Severity</w:t>
+            </w:r>
+          </w:p>
+        </w:tc>
+        <w:tc>
+          <w:tcPr>
+            <w:tcW w:type="dxa" w:w="6912"/>
+          </w:tcPr>
+          <w:p>
+            <w:r>
+              <w:rPr>
+                <w:b w:val="0"/>
+              </w:rPr>
+              <w:t>Minor</w:t>
+            </w:r>
+          </w:p>
+        </w:tc>
+      </w:tr>
+      <w:tr>
+        <w:tc>
+          <w:tcPr>
+            <w:tcW w:type="dxa" w:w="2016"/>
+          </w:tcPr>
+          <w:p>
+            <w:r>
+              <w:rPr>
+                <w:b/>
+              </w:rPr>
+              <w:t>Priority</w:t>
+            </w:r>
+          </w:p>
+        </w:tc>
+        <w:tc>
+          <w:tcPr>
+            <w:tcW w:type="dxa" w:w="6912"/>
+          </w:tcPr>
+          <w:p>
+            <w:r>
+              <w:rPr>
+                <w:b w:val="0"/>
+              </w:rPr>
+              <w:t>Low</w:t>
+            </w:r>
+          </w:p>
+        </w:tc>
+      </w:tr>
+      <w:tr>
+        <w:tc>
+          <w:tcPr>
+            <w:tcW w:type="dxa" w:w="2016"/>
+          </w:tcPr>
+          <w:p>
+            <w:r>
+              <w:rPr>
+                <w:b/>
+              </w:rPr>
+              <w:t>Status</w:t>
+            </w:r>
+          </w:p>
+        </w:tc>
+        <w:tc>
+          <w:tcPr>
+            <w:tcW w:type="dxa" w:w="6912"/>
+          </w:tcPr>
+          <w:p>
+            <w:r>
+              <w:rPr>
+                <w:b w:val="0"/>
+              </w:rPr>
+              <w:t>Open</w:t>
+            </w:r>
+          </w:p>
+        </w:tc>
+      </w:tr>
+      <w:tr>
+        <w:tc>
+          <w:tcPr>
+            <w:tcW w:type="dxa" w:w="2016"/>
+          </w:tcPr>
+          <w:p>
+            <w:r>
+              <w:rPr>
+                <w:b/>
+              </w:rPr>
+              <w:t>Steps</w:t>
+            </w:r>
+          </w:p>
+        </w:tc>
+        <w:tc>
+          <w:tcPr>
+            <w:tcW w:type="dxa" w:w="6912"/>
+          </w:tcPr>
+          <w:p>
+            <w:r>
+              <w:rPr>
+                <w:b w:val="0"/>
+              </w:rPr>
+              <w:t>1. Go to Inventory.</w:t>
+            </w:r>
+          </w:p>
+          <w:p>
+            <w:r>
+              <w:rPr>
+                <w:b w:val="0"/>
+              </w:rPr>
+              <w:t>2. Check Stock Qty of Anarkali Suit Set (Out of Stock).</w:t>
+            </w:r>
+          </w:p>
+        </w:tc>
+      </w:tr>
+      <w:tr>
+        <w:tc>
+          <w:tcPr>
+            <w:tcW w:type="dxa" w:w="2016"/>
+          </w:tcPr>
+          <w:p>
+            <w:r>
+              <w:rPr>
+                <w:b/>
+              </w:rPr>
+              <w:t>Expected Result</w:t>
+            </w:r>
+          </w:p>
+        </w:tc>
+        <w:tc>
+          <w:tcPr>
+            <w:tcW w:type="dxa" w:w="6912"/>
+          </w:tcPr>
+          <w:p>
+            <w:r>
+              <w:rPr>
+                <w:b w:val="0"/>
+              </w:rPr>
+              <w:t>0 is shown in red.</w:t>
+            </w:r>
+          </w:p>
+        </w:tc>
+      </w:tr>
+      <w:tr>
+        <w:tc>
+          <w:tcPr>
+            <w:tcW w:type="dxa" w:w="2016"/>
+          </w:tcPr>
+          <w:p>
+            <w:r>
+              <w:rPr>
+                <w:b/>
+              </w:rPr>
+              <w:t>Actual Result</w:t>
+            </w:r>
+          </w:p>
+        </w:tc>
+        <w:tc>
+          <w:tcPr>
+            <w:tcW w:type="dxa" w:w="6912"/>
+          </w:tcPr>
+          <w:p>
+            <w:r>
+              <w:rPr>
+                <w:b w:val="0"/>
+              </w:rPr>
+              <w:t>0 is shown in black, same as normal items.</w:t>
+            </w:r>
+          </w:p>
+        </w:tc>
+      </w:tr>
+      <w:tr>
+        <w:tc>
+          <w:tcPr>
+            <w:tcW w:type="dxa" w:w="2016"/>
+          </w:tcPr>
+          <w:p>
+            <w:r>
+              <w:rPr>
+                <w:b/>
+              </w:rPr>
+              <w:t>File / Line</w:t>
+            </w:r>
+          </w:p>
+        </w:tc>
+        <w:tc>
+          <w:tcPr>
+            <w:tcW w:type="dxa" w:w="6912"/>
+          </w:tcPr>
+          <w:p>
+            <w:r>
+              <w:rPr>
+                <w:b w:val="0"/>
+              </w:rPr>
+              <w:t>src/pages/InventoryOverview.jsx : 202</w:t>
+            </w:r>
+          </w:p>
+        </w:tc>
+      </w:tr>
+      <w:tr>
+        <w:tc>
+          <w:tcPr>
+            <w:tcW w:type="dxa" w:w="2016"/>
+          </w:tcPr>
+          <w:p>
+            <w:r>
+              <w:rPr>
+                <w:b/>
+              </w:rPr>
+              <w:t>Root Cause</w:t>
+            </w:r>
+          </w:p>
+        </w:tc>
+        <w:tc>
+          <w:tcPr>
+            <w:tcW w:type="dxa" w:w="6912"/>
+          </w:tcPr>
+          <w:p>
+            <w:r>
+              <w:rPr>
+                <w:b w:val="0"/>
+              </w:rPr>
+              <w:t>Condition is quantity &lt; 0. It should be quantity &lt;= 0.</w:t>
+            </w:r>
+          </w:p>
+        </w:tc>
+      </w:tr>
+    </w:tbl>
     <w:p>
       <w:pPr>
-        <w:pStyle w:val="Heading2"/>
+        <w:keepNext/>
+        <w:spacing w:before="160"/>
       </w:pPr>
-      <w:r>
-        <w:t>Where the system breaks</w:t>
-      </w:r>
-    </w:p>
-    <w:p>
-      <w:pPr>
-        <w:pStyle w:val="ListBullet"/>
-      </w:pPr>
-      <w:r>
-        <w:t>File: src/pages/AlertCenter.jsx, line 96</w:t>
-      </w:r>
-    </w:p>
-    <w:p>
-      <w:pPr>
-        <w:pStyle w:val="ListBullet"/>
-      </w:pPr>
-      <w:r>
-        <w:t xml:space="preserve">Wrong code (now): </w:t>
-      </w:r>
-      <w:r>
-        <w:rPr>
-          <w:rFonts w:ascii="Consolas" w:hAnsi="Consolas"/>
-        </w:rPr>
-        <w:t>Out of Stock ({outOfStock.length - 1})</w:t>
-      </w:r>
-    </w:p>
-    <w:p>
-      <w:pPr>
-        <w:pStyle w:val="ListBullet"/>
-      </w:pPr>
-      <w:r>
-        <w:t xml:space="preserve">Right code: </w:t>
-      </w:r>
-      <w:r>
-        <w:rPr>
-          <w:rFonts w:ascii="Consolas" w:hAnsi="Consolas"/>
-        </w:rPr>
-        <w:t>Out of Stock ({outOfStock.length})</w:t>
-      </w:r>
-    </w:p>
-    <w:p>
-      <w:pPr>
-        <w:pStyle w:val="ListBullet"/>
-      </w:pPr>
-      <w:r>
-        <w:t>Why: The code takes 1 away from the real count before showing it.</w:t>
-      </w:r>
-    </w:p>
-    <w:p>
-      <w:r>
-        <w:br w:type="page"/>
-      </w:r>
-    </w:p>
-    <w:p>
-      <w:pPr>
-        <w:pStyle w:val="Heading1"/>
-      </w:pPr>
-      <w:r>
-        <w:t>BUG-04: A stock of 0 is not shown in red</w:t>
-      </w:r>
-    </w:p>
-    <w:p>
       <w:r>
         <w:rPr>
           <w:b/>
         </w:rPr>
-        <w:t xml:space="preserve">Page: </w:t>
-      </w:r>
-      <w:r>
-        <w:t>Inventory Overview  (/inventory)</w:t>
-      </w:r>
-    </w:p>
-    <w:p>
-      <w:r>
-        <w:rPr>
-          <w:b/>
-        </w:rPr>
-        <w:t xml:space="preserve">Severity: </w:t>
-      </w:r>
-      <w:r>
-        <w:t>Minor</w:t>
-      </w:r>
-    </w:p>
-    <w:p>
-      <w:r>
-        <w:rPr>
-          <w:b/>
-        </w:rPr>
-        <w:t xml:space="preserve">Result: </w:t>
-      </w:r>
-      <w:r>
-        <w:rPr>
-          <w:b/>
-          <w:color w:val="B91C1C"/>
-        </w:rPr>
-        <w:t>FAIL</w:t>
-      </w:r>
-    </w:p>
-    <w:p>
-      <w:pPr>
-        <w:pStyle w:val="Heading2"/>
-      </w:pPr>
-      <w:r>
-        <w:t>Steps to see it</w:t>
-      </w:r>
-    </w:p>
-    <w:p>
-      <w:pPr>
-        <w:pStyle w:val="ListNumber"/>
-      </w:pPr>
-      <w:r>
-        <w:t>Open Inventory.</w:t>
-      </w:r>
-    </w:p>
-    <w:p>
-      <w:pPr>
-        <w:pStyle w:val="ListNumber"/>
-      </w:pPr>
-      <w:r>
-        <w:t>Look at the STOCK QTY column for "Anarkali Suit Set" (status: Out of Stock).</w:t>
-      </w:r>
-    </w:p>
-    <w:p>
-      <w:pPr>
-        <w:pStyle w:val="Heading2"/>
-      </w:pPr>
-      <w:r>
-        <w:t>Expected output</w:t>
-      </w:r>
-    </w:p>
-    <w:p>
-      <w:r>
-        <w:t>The 0 is red, so the owner sees at once that it is sold out.</w:t>
+        <w:t>Expected:</w:t>
       </w:r>
     </w:p>
     <w:p>
       <w:r>
         <w:drawing>
           <wp:inline xmlns:a="http://schemas.openxmlformats.org/drawingml/2006/main" xmlns:pic="http://schemas.openxmlformats.org/drawingml/2006/picture">
-            <wp:extent cx="5669280" cy="3735250"/>
+            <wp:extent cx="3931920" cy="2590577"/>
             <wp:docPr id="7" name="Picture 7"/>
             <wp:cNvGraphicFramePr>
               <a:graphicFrameLocks noChangeAspect="1"/>
@@ -1356,7 +2306,7 @@
                   <pic:spPr>
                     <a:xfrm>
                       <a:off x="0" y="0"/>
-                      <a:ext cx="5669280" cy="3735250"/>
+                      <a:ext cx="3931920" cy="2590577"/>
                     </a:xfrm>
                     <a:prstGeom prst="rect"/>
                   </pic:spPr>
@@ -1368,31 +2318,22 @@
       </w:r>
     </w:p>
     <w:p>
+      <w:pPr>
+        <w:keepNext/>
+        <w:spacing w:before="160"/>
+      </w:pPr>
       <w:r>
         <w:rPr>
-          <w:i/>
+          <w:b/>
         </w:rPr>
-        <w:t>Screenshot: main app (correct)</w:t>
-      </w:r>
-    </w:p>
-    <w:p>
-      <w:pPr>
-        <w:pStyle w:val="Heading2"/>
-      </w:pPr>
-      <w:r>
-        <w:t>Actual output (coming output)</w:t>
-      </w:r>
-    </w:p>
-    <w:p>
-      <w:r>
-        <w:t>The 0 is black, the same as items that are fine. Only a stock below 0 would turn red.</w:t>
+        <w:t>Actual:</w:t>
       </w:r>
     </w:p>
     <w:p>
       <w:r>
         <w:drawing>
           <wp:inline xmlns:a="http://schemas.openxmlformats.org/drawingml/2006/main" xmlns:pic="http://schemas.openxmlformats.org/drawingml/2006/picture">
-            <wp:extent cx="5669280" cy="3735250"/>
+            <wp:extent cx="3931920" cy="2590577"/>
             <wp:docPr id="8" name="Picture 8"/>
             <wp:cNvGraphicFramePr>
               <a:graphicFrameLocks noChangeAspect="1"/>
@@ -1413,7 +2354,7 @@
                   <pic:spPr>
                     <a:xfrm>
                       <a:off x="0" y="0"/>
-                      <a:ext cx="5669280" cy="3735250"/>
+                      <a:ext cx="3931920" cy="2590577"/>
                     </a:xfrm>
                     <a:prstGeom prst="rect"/>
                   </pic:spPr>
@@ -1425,157 +2366,302 @@
       </w:r>
     </w:p>
     <w:p>
+      <w:pPr>
+        <w:pStyle w:val="Heading1"/>
+        <w:pageBreakBefore/>
+      </w:pPr>
       <w:r>
-        <w:rPr>
-          <w:i/>
-        </w:rPr>
-        <w:t>Screenshot: bug branch (wrong)</w:t>
+        <w:t>BUG-05 - Stock Units column shows variant count</w:t>
       </w:r>
     </w:p>
+    <w:tbl>
+      <w:tblPr>
+        <w:tblStyle w:val="TableGrid"/>
+        <w:tblW w:type="auto" w:w="0"/>
+        <w:tblLook w:firstColumn="1" w:firstRow="1" w:lastColumn="0" w:lastRow="0" w:noHBand="0" w:noVBand="1" w:val="04A0"/>
+      </w:tblPr>
+      <w:tblGrid>
+        <w:gridCol w:w="4320"/>
+        <w:gridCol w:w="4320"/>
+      </w:tblGrid>
+      <w:tr>
+        <w:tc>
+          <w:tcPr>
+            <w:tcW w:type="dxa" w:w="2016"/>
+          </w:tcPr>
+          <w:p>
+            <w:r>
+              <w:rPr>
+                <w:b/>
+              </w:rPr>
+              <w:t>Module</w:t>
+            </w:r>
+          </w:p>
+        </w:tc>
+        <w:tc>
+          <w:tcPr>
+            <w:tcW w:type="dxa" w:w="6912"/>
+          </w:tcPr>
+          <w:p>
+            <w:r>
+              <w:rPr>
+                <w:b w:val="0"/>
+              </w:rPr>
+              <w:t>Products</w:t>
+            </w:r>
+          </w:p>
+        </w:tc>
+      </w:tr>
+      <w:tr>
+        <w:tc>
+          <w:tcPr>
+            <w:tcW w:type="dxa" w:w="2016"/>
+          </w:tcPr>
+          <w:p>
+            <w:r>
+              <w:rPr>
+                <w:b/>
+              </w:rPr>
+              <w:t>Severity</w:t>
+            </w:r>
+          </w:p>
+        </w:tc>
+        <w:tc>
+          <w:tcPr>
+            <w:tcW w:type="dxa" w:w="6912"/>
+          </w:tcPr>
+          <w:p>
+            <w:r>
+              <w:rPr>
+                <w:b w:val="0"/>
+              </w:rPr>
+              <w:t>Major</w:t>
+            </w:r>
+          </w:p>
+        </w:tc>
+      </w:tr>
+      <w:tr>
+        <w:tc>
+          <w:tcPr>
+            <w:tcW w:type="dxa" w:w="2016"/>
+          </w:tcPr>
+          <w:p>
+            <w:r>
+              <w:rPr>
+                <w:b/>
+              </w:rPr>
+              <w:t>Priority</w:t>
+            </w:r>
+          </w:p>
+        </w:tc>
+        <w:tc>
+          <w:tcPr>
+            <w:tcW w:type="dxa" w:w="6912"/>
+          </w:tcPr>
+          <w:p>
+            <w:r>
+              <w:rPr>
+                <w:b w:val="0"/>
+              </w:rPr>
+              <w:t>High</w:t>
+            </w:r>
+          </w:p>
+        </w:tc>
+      </w:tr>
+      <w:tr>
+        <w:tc>
+          <w:tcPr>
+            <w:tcW w:type="dxa" w:w="2016"/>
+          </w:tcPr>
+          <w:p>
+            <w:r>
+              <w:rPr>
+                <w:b/>
+              </w:rPr>
+              <w:t>Status</w:t>
+            </w:r>
+          </w:p>
+        </w:tc>
+        <w:tc>
+          <w:tcPr>
+            <w:tcW w:type="dxa" w:w="6912"/>
+          </w:tcPr>
+          <w:p>
+            <w:r>
+              <w:rPr>
+                <w:b w:val="0"/>
+              </w:rPr>
+              <w:t>Open</w:t>
+            </w:r>
+          </w:p>
+        </w:tc>
+      </w:tr>
+      <w:tr>
+        <w:tc>
+          <w:tcPr>
+            <w:tcW w:type="dxa" w:w="2016"/>
+          </w:tcPr>
+          <w:p>
+            <w:r>
+              <w:rPr>
+                <w:b/>
+              </w:rPr>
+              <w:t>Steps</w:t>
+            </w:r>
+          </w:p>
+        </w:tc>
+        <w:tc>
+          <w:tcPr>
+            <w:tcW w:type="dxa" w:w="6912"/>
+          </w:tcPr>
+          <w:p>
+            <w:r>
+              <w:rPr>
+                <w:b w:val="0"/>
+              </w:rPr>
+              <w:t>1. Go to Products.</w:t>
+            </w:r>
+          </w:p>
+          <w:p>
+            <w:r>
+              <w:rPr>
+                <w:b w:val="0"/>
+              </w:rPr>
+              <w:t>2. Check Variants and Stock Units for Cotton Kurti.</w:t>
+            </w:r>
+          </w:p>
+        </w:tc>
+      </w:tr>
+      <w:tr>
+        <w:tc>
+          <w:tcPr>
+            <w:tcW w:type="dxa" w:w="2016"/>
+          </w:tcPr>
+          <w:p>
+            <w:r>
+              <w:rPr>
+                <w:b/>
+              </w:rPr>
+              <w:t>Expected Result</w:t>
+            </w:r>
+          </w:p>
+        </w:tc>
+        <w:tc>
+          <w:tcPr>
+            <w:tcW w:type="dxa" w:w="6912"/>
+          </w:tcPr>
+          <w:p>
+            <w:r>
+              <w:rPr>
+                <w:b w:val="0"/>
+              </w:rPr>
+              <w:t>Variants 4, Stock Units 28.</w:t>
+            </w:r>
+          </w:p>
+        </w:tc>
+      </w:tr>
+      <w:tr>
+        <w:tc>
+          <w:tcPr>
+            <w:tcW w:type="dxa" w:w="2016"/>
+          </w:tcPr>
+          <w:p>
+            <w:r>
+              <w:rPr>
+                <w:b/>
+              </w:rPr>
+              <w:t>Actual Result</w:t>
+            </w:r>
+          </w:p>
+        </w:tc>
+        <w:tc>
+          <w:tcPr>
+            <w:tcW w:type="dxa" w:w="6912"/>
+          </w:tcPr>
+          <w:p>
+            <w:r>
+              <w:rPr>
+                <w:b w:val="0"/>
+              </w:rPr>
+              <w:t>Variants 4, Stock Units 4. Out of stock items show 1 unit.</w:t>
+            </w:r>
+          </w:p>
+        </w:tc>
+      </w:tr>
+      <w:tr>
+        <w:tc>
+          <w:tcPr>
+            <w:tcW w:type="dxa" w:w="2016"/>
+          </w:tcPr>
+          <w:p>
+            <w:r>
+              <w:rPr>
+                <w:b/>
+              </w:rPr>
+              <w:t>File / Line</w:t>
+            </w:r>
+          </w:p>
+        </w:tc>
+        <w:tc>
+          <w:tcPr>
+            <w:tcW w:type="dxa" w:w="6912"/>
+          </w:tcPr>
+          <w:p>
+            <w:r>
+              <w:rPr>
+                <w:b w:val="0"/>
+              </w:rPr>
+              <w:t>src/pages/Products.jsx : 372</w:t>
+            </w:r>
+          </w:p>
+        </w:tc>
+      </w:tr>
+      <w:tr>
+        <w:tc>
+          <w:tcPr>
+            <w:tcW w:type="dxa" w:w="2016"/>
+          </w:tcPr>
+          <w:p>
+            <w:r>
+              <w:rPr>
+                <w:b/>
+              </w:rPr>
+              <w:t>Root Cause</w:t>
+            </w:r>
+          </w:p>
+        </w:tc>
+        <w:tc>
+          <w:tcPr>
+            <w:tcW w:type="dxa" w:w="6912"/>
+          </w:tcPr>
+          <w:p>
+            <w:r>
+              <w:rPr>
+                <w:b w:val="0"/>
+              </w:rPr>
+              <w:t>Column reads variantSummary.variantCount instead of variantSummary.totalUnits.</w:t>
+            </w:r>
+          </w:p>
+        </w:tc>
+      </w:tr>
+    </w:tbl>
     <w:p>
       <w:pPr>
-        <w:pStyle w:val="Heading2"/>
+        <w:keepNext/>
+        <w:spacing w:before="160"/>
       </w:pPr>
-      <w:r>
-        <w:t>Where the system breaks</w:t>
-      </w:r>
-    </w:p>
-    <w:p>
-      <w:pPr>
-        <w:pStyle w:val="ListBullet"/>
-      </w:pPr>
-      <w:r>
-        <w:t>File: src/pages/InventoryOverview.jsx, line 202</w:t>
-      </w:r>
-    </w:p>
-    <w:p>
-      <w:pPr>
-        <w:pStyle w:val="ListBullet"/>
-      </w:pPr>
-      <w:r>
-        <w:t xml:space="preserve">Wrong code (now): </w:t>
-      </w:r>
-      <w:r>
-        <w:rPr>
-          <w:rFonts w:ascii="Consolas" w:hAnsi="Consolas"/>
-        </w:rPr>
-        <w:t>color: variant.quantity &lt; 0 ? 'var(--accent-danger)' : 'inherit'</w:t>
-      </w:r>
-    </w:p>
-    <w:p>
-      <w:pPr>
-        <w:pStyle w:val="ListBullet"/>
-      </w:pPr>
-      <w:r>
-        <w:t xml:space="preserve">Right code: </w:t>
-      </w:r>
-      <w:r>
-        <w:rPr>
-          <w:rFonts w:ascii="Consolas" w:hAnsi="Consolas"/>
-        </w:rPr>
-        <w:t>color: variant.quantity &lt;= 0 ? 'var(--accent-danger)' : 'inherit'</w:t>
-      </w:r>
-    </w:p>
-    <w:p>
-      <w:pPr>
-        <w:pStyle w:val="ListBullet"/>
-      </w:pPr>
-      <w:r>
-        <w:t>Why: The check uses "less than 0" instead of "0 or less", so exactly 0 is left out.</w:t>
-      </w:r>
-    </w:p>
-    <w:p>
-      <w:r>
-        <w:br w:type="page"/>
-      </w:r>
-    </w:p>
-    <w:p>
-      <w:pPr>
-        <w:pStyle w:val="Heading1"/>
-      </w:pPr>
-      <w:r>
-        <w:t>BUG-05: Products page: "Stock Units" shows the number of variants, not the stock</w:t>
-      </w:r>
-    </w:p>
-    <w:p>
       <w:r>
         <w:rPr>
           <w:b/>
         </w:rPr>
-        <w:t xml:space="preserve">Page: </w:t>
-      </w:r>
-      <w:r>
-        <w:t>Products  (/products)</w:t>
-      </w:r>
-    </w:p>
-    <w:p>
-      <w:r>
-        <w:rPr>
-          <w:b/>
-        </w:rPr>
-        <w:t xml:space="preserve">Severity: </w:t>
-      </w:r>
-      <w:r>
-        <w:t>Minor</w:t>
-      </w:r>
-    </w:p>
-    <w:p>
-      <w:r>
-        <w:rPr>
-          <w:b/>
-        </w:rPr>
-        <w:t xml:space="preserve">Result: </w:t>
-      </w:r>
-      <w:r>
-        <w:rPr>
-          <w:b/>
-          <w:color w:val="B91C1C"/>
-        </w:rPr>
-        <w:t>FAIL</w:t>
-      </w:r>
-    </w:p>
-    <w:p>
-      <w:pPr>
-        <w:pStyle w:val="Heading2"/>
-      </w:pPr>
-      <w:r>
-        <w:t>Steps to see it</w:t>
-      </w:r>
-    </w:p>
-    <w:p>
-      <w:pPr>
-        <w:pStyle w:val="ListNumber"/>
-      </w:pPr>
-      <w:r>
-        <w:t>Open Products.</w:t>
-      </w:r>
-    </w:p>
-    <w:p>
-      <w:pPr>
-        <w:pStyle w:val="ListNumber"/>
-      </w:pPr>
-      <w:r>
-        <w:t>Look at the VARIANTS and STOCK UNITS columns for "Cotton Kurti".</w:t>
-      </w:r>
-    </w:p>
-    <w:p>
-      <w:pPr>
-        <w:pStyle w:val="Heading2"/>
-      </w:pPr>
-      <w:r>
-        <w:t>Expected output</w:t>
-      </w:r>
-    </w:p>
-    <w:p>
-      <w:r>
-        <w:t>VARIANTS = 4 and STOCK UNITS = 28 (the real pieces in stock).</w:t>
+        <w:t>Expected:</w:t>
       </w:r>
     </w:p>
     <w:p>
       <w:r>
         <w:drawing>
           <wp:inline xmlns:a="http://schemas.openxmlformats.org/drawingml/2006/main" xmlns:pic="http://schemas.openxmlformats.org/drawingml/2006/picture">
-            <wp:extent cx="5669280" cy="3735250"/>
+            <wp:extent cx="3931920" cy="2590577"/>
             <wp:docPr id="9" name="Picture 9"/>
             <wp:cNvGraphicFramePr>
               <a:graphicFrameLocks noChangeAspect="1"/>
@@ -1596,7 +2682,7 @@
                   <pic:spPr>
                     <a:xfrm>
                       <a:off x="0" y="0"/>
-                      <a:ext cx="5669280" cy="3735250"/>
+                      <a:ext cx="3931920" cy="2590577"/>
                     </a:xfrm>
                     <a:prstGeom prst="rect"/>
                   </pic:spPr>
@@ -1608,31 +2694,22 @@
       </w:r>
     </w:p>
     <w:p>
+      <w:pPr>
+        <w:keepNext/>
+        <w:spacing w:before="160"/>
+      </w:pPr>
       <w:r>
         <w:rPr>
-          <w:i/>
+          <w:b/>
         </w:rPr>
-        <w:t>Screenshot: main app (correct)</w:t>
-      </w:r>
-    </w:p>
-    <w:p>
-      <w:pPr>
-        <w:pStyle w:val="Heading2"/>
-      </w:pPr>
-      <w:r>
-        <w:t>Actual output (coming output)</w:t>
-      </w:r>
-    </w:p>
-    <w:p>
-      <w:r>
-        <w:t>VARIANTS = 4 and STOCK UNITS = 4. Every row shows the same number in both columns. Sold-out items (Linen Cotton Saree) show 1 unit instead of 0.</w:t>
+        <w:t>Actual:</w:t>
       </w:r>
     </w:p>
     <w:p>
       <w:r>
         <w:drawing>
           <wp:inline xmlns:a="http://schemas.openxmlformats.org/drawingml/2006/main" xmlns:pic="http://schemas.openxmlformats.org/drawingml/2006/picture">
-            <wp:extent cx="5669280" cy="3735250"/>
+            <wp:extent cx="3931920" cy="2590577"/>
             <wp:docPr id="10" name="Picture 10"/>
             <wp:cNvGraphicFramePr>
               <a:graphicFrameLocks noChangeAspect="1"/>
@@ -1653,7 +2730,7 @@
                   <pic:spPr>
                     <a:xfrm>
                       <a:off x="0" y="0"/>
-                      <a:ext cx="5669280" cy="3735250"/>
+                      <a:ext cx="3931920" cy="2590577"/>
                     </a:xfrm>
                     <a:prstGeom prst="rect"/>
                   </pic:spPr>
@@ -1665,157 +2742,302 @@
       </w:r>
     </w:p>
     <w:p>
+      <w:pPr>
+        <w:pStyle w:val="Heading1"/>
+        <w:pageBreakBefore/>
+      </w:pPr>
       <w:r>
-        <w:rPr>
-          <w:i/>
-        </w:rPr>
-        <w:t>Screenshot: bug branch (wrong)</w:t>
+        <w:t>BUG-06 - Customer created date shows wrong month</w:t>
       </w:r>
     </w:p>
+    <w:tbl>
+      <w:tblPr>
+        <w:tblStyle w:val="TableGrid"/>
+        <w:tblW w:type="auto" w:w="0"/>
+        <w:tblLook w:firstColumn="1" w:firstRow="1" w:lastColumn="0" w:lastRow="0" w:noHBand="0" w:noVBand="1" w:val="04A0"/>
+      </w:tblPr>
+      <w:tblGrid>
+        <w:gridCol w:w="4320"/>
+        <w:gridCol w:w="4320"/>
+      </w:tblGrid>
+      <w:tr>
+        <w:tc>
+          <w:tcPr>
+            <w:tcW w:type="dxa" w:w="2016"/>
+          </w:tcPr>
+          <w:p>
+            <w:r>
+              <w:rPr>
+                <w:b/>
+              </w:rPr>
+              <w:t>Module</w:t>
+            </w:r>
+          </w:p>
+        </w:tc>
+        <w:tc>
+          <w:tcPr>
+            <w:tcW w:type="dxa" w:w="6912"/>
+          </w:tcPr>
+          <w:p>
+            <w:r>
+              <w:rPr>
+                <w:b w:val="0"/>
+              </w:rPr>
+              <w:t>Customers</w:t>
+            </w:r>
+          </w:p>
+        </w:tc>
+      </w:tr>
+      <w:tr>
+        <w:tc>
+          <w:tcPr>
+            <w:tcW w:type="dxa" w:w="2016"/>
+          </w:tcPr>
+          <w:p>
+            <w:r>
+              <w:rPr>
+                <w:b/>
+              </w:rPr>
+              <w:t>Severity</w:t>
+            </w:r>
+          </w:p>
+        </w:tc>
+        <w:tc>
+          <w:tcPr>
+            <w:tcW w:type="dxa" w:w="6912"/>
+          </w:tcPr>
+          <w:p>
+            <w:r>
+              <w:rPr>
+                <w:b w:val="0"/>
+              </w:rPr>
+              <w:t>Minor</w:t>
+            </w:r>
+          </w:p>
+        </w:tc>
+      </w:tr>
+      <w:tr>
+        <w:tc>
+          <w:tcPr>
+            <w:tcW w:type="dxa" w:w="2016"/>
+          </w:tcPr>
+          <w:p>
+            <w:r>
+              <w:rPr>
+                <w:b/>
+              </w:rPr>
+              <w:t>Priority</w:t>
+            </w:r>
+          </w:p>
+        </w:tc>
+        <w:tc>
+          <w:tcPr>
+            <w:tcW w:type="dxa" w:w="6912"/>
+          </w:tcPr>
+          <w:p>
+            <w:r>
+              <w:rPr>
+                <w:b w:val="0"/>
+              </w:rPr>
+              <w:t>Medium</w:t>
+            </w:r>
+          </w:p>
+        </w:tc>
+      </w:tr>
+      <w:tr>
+        <w:tc>
+          <w:tcPr>
+            <w:tcW w:type="dxa" w:w="2016"/>
+          </w:tcPr>
+          <w:p>
+            <w:r>
+              <w:rPr>
+                <w:b/>
+              </w:rPr>
+              <w:t>Status</w:t>
+            </w:r>
+          </w:p>
+        </w:tc>
+        <w:tc>
+          <w:tcPr>
+            <w:tcW w:type="dxa" w:w="6912"/>
+          </w:tcPr>
+          <w:p>
+            <w:r>
+              <w:rPr>
+                <w:b w:val="0"/>
+              </w:rPr>
+              <w:t>Open</w:t>
+            </w:r>
+          </w:p>
+        </w:tc>
+      </w:tr>
+      <w:tr>
+        <w:tc>
+          <w:tcPr>
+            <w:tcW w:type="dxa" w:w="2016"/>
+          </w:tcPr>
+          <w:p>
+            <w:r>
+              <w:rPr>
+                <w:b/>
+              </w:rPr>
+              <w:t>Steps</w:t>
+            </w:r>
+          </w:p>
+        </w:tc>
+        <w:tc>
+          <w:tcPr>
+            <w:tcW w:type="dxa" w:w="6912"/>
+          </w:tcPr>
+          <w:p>
+            <w:r>
+              <w:rPr>
+                <w:b w:val="0"/>
+              </w:rPr>
+              <w:t>1. Go to Customers.</w:t>
+            </w:r>
+          </w:p>
+          <w:p>
+            <w:r>
+              <w:rPr>
+                <w:b w:val="0"/>
+              </w:rPr>
+              <w:t>2. Check the Created date under any customer (created on 6 Oct 2026).</w:t>
+            </w:r>
+          </w:p>
+        </w:tc>
+      </w:tr>
+      <w:tr>
+        <w:tc>
+          <w:tcPr>
+            <w:tcW w:type="dxa" w:w="2016"/>
+          </w:tcPr>
+          <w:p>
+            <w:r>
+              <w:rPr>
+                <w:b/>
+              </w:rPr>
+              <w:t>Expected Result</w:t>
+            </w:r>
+          </w:p>
+        </w:tc>
+        <w:tc>
+          <w:tcPr>
+            <w:tcW w:type="dxa" w:w="6912"/>
+          </w:tcPr>
+          <w:p>
+            <w:r>
+              <w:rPr>
+                <w:b w:val="0"/>
+              </w:rPr>
+              <w:t>Created 6/10/2026</w:t>
+            </w:r>
+          </w:p>
+        </w:tc>
+      </w:tr>
+      <w:tr>
+        <w:tc>
+          <w:tcPr>
+            <w:tcW w:type="dxa" w:w="2016"/>
+          </w:tcPr>
+          <w:p>
+            <w:r>
+              <w:rPr>
+                <w:b/>
+              </w:rPr>
+              <w:t>Actual Result</w:t>
+            </w:r>
+          </w:p>
+        </w:tc>
+        <w:tc>
+          <w:tcPr>
+            <w:tcW w:type="dxa" w:w="6912"/>
+          </w:tcPr>
+          <w:p>
+            <w:r>
+              <w:rPr>
+                <w:b w:val="0"/>
+              </w:rPr>
+              <w:t>Created 6/9/2026</w:t>
+            </w:r>
+          </w:p>
+        </w:tc>
+      </w:tr>
+      <w:tr>
+        <w:tc>
+          <w:tcPr>
+            <w:tcW w:type="dxa" w:w="2016"/>
+          </w:tcPr>
+          <w:p>
+            <w:r>
+              <w:rPr>
+                <w:b/>
+              </w:rPr>
+              <w:t>File / Line</w:t>
+            </w:r>
+          </w:p>
+        </w:tc>
+        <w:tc>
+          <w:tcPr>
+            <w:tcW w:type="dxa" w:w="6912"/>
+          </w:tcPr>
+          <w:p>
+            <w:r>
+              <w:rPr>
+                <w:b w:val="0"/>
+              </w:rPr>
+              <w:t>src/pages/sales/Customers.jsx : 186</w:t>
+            </w:r>
+          </w:p>
+        </w:tc>
+      </w:tr>
+      <w:tr>
+        <w:tc>
+          <w:tcPr>
+            <w:tcW w:type="dxa" w:w="2016"/>
+          </w:tcPr>
+          <w:p>
+            <w:r>
+              <w:rPr>
+                <w:b/>
+              </w:rPr>
+              <w:t>Root Cause</w:t>
+            </w:r>
+          </w:p>
+        </w:tc>
+        <w:tc>
+          <w:tcPr>
+            <w:tcW w:type="dxa" w:w="6912"/>
+          </w:tcPr>
+          <w:p>
+            <w:r>
+              <w:rPr>
+                <w:b w:val="0"/>
+              </w:rPr>
+              <w:t>Date is built with getMonth(), which starts from 0. October shows as 9.</w:t>
+            </w:r>
+          </w:p>
+        </w:tc>
+      </w:tr>
+    </w:tbl>
     <w:p>
       <w:pPr>
-        <w:pStyle w:val="Heading2"/>
+        <w:keepNext/>
+        <w:spacing w:before="160"/>
       </w:pPr>
-      <w:r>
-        <w:t>Where the system breaks</w:t>
-      </w:r>
-    </w:p>
-    <w:p>
-      <w:pPr>
-        <w:pStyle w:val="ListBullet"/>
-      </w:pPr>
-      <w:r>
-        <w:t>File: src/pages/Products.jsx, line 372</w:t>
-      </w:r>
-    </w:p>
-    <w:p>
-      <w:pPr>
-        <w:pStyle w:val="ListBullet"/>
-      </w:pPr>
-      <w:r>
-        <w:t xml:space="preserve">Wrong code (now): </w:t>
-      </w:r>
-      <w:r>
-        <w:rPr>
-          <w:rFonts w:ascii="Consolas" w:hAnsi="Consolas"/>
-        </w:rPr>
-        <w:t>{product.variantSummary?.variantCount || 0}</w:t>
-      </w:r>
-    </w:p>
-    <w:p>
-      <w:pPr>
-        <w:pStyle w:val="ListBullet"/>
-      </w:pPr>
-      <w:r>
-        <w:t xml:space="preserve">Right code: </w:t>
-      </w:r>
-      <w:r>
-        <w:rPr>
-          <w:rFonts w:ascii="Consolas" w:hAnsi="Consolas"/>
-        </w:rPr>
-        <w:t>{product.variantSummary?.totalUnits || 0}</w:t>
-      </w:r>
-    </w:p>
-    <w:p>
-      <w:pPr>
-        <w:pStyle w:val="ListBullet"/>
-      </w:pPr>
-      <w:r>
-        <w:t>Why: The STOCK UNITS column reads the variant count field instead of the total units field.</w:t>
-      </w:r>
-    </w:p>
-    <w:p>
-      <w:r>
-        <w:br w:type="page"/>
-      </w:r>
-    </w:p>
-    <w:p>
-      <w:pPr>
-        <w:pStyle w:val="Heading1"/>
-      </w:pPr>
-      <w:r>
-        <w:t>BUG-06: Customers page: the "Created" date shows the wrong month</w:t>
-      </w:r>
-    </w:p>
-    <w:p>
       <w:r>
         <w:rPr>
           <w:b/>
         </w:rPr>
-        <w:t xml:space="preserve">Page: </w:t>
-      </w:r>
-      <w:r>
-        <w:t>Customers  (/customers)</w:t>
-      </w:r>
-    </w:p>
-    <w:p>
-      <w:r>
-        <w:rPr>
-          <w:b/>
-        </w:rPr>
-        <w:t xml:space="preserve">Severity: </w:t>
-      </w:r>
-      <w:r>
-        <w:t>Minor</w:t>
-      </w:r>
-    </w:p>
-    <w:p>
-      <w:r>
-        <w:rPr>
-          <w:b/>
-        </w:rPr>
-        <w:t xml:space="preserve">Result: </w:t>
-      </w:r>
-      <w:r>
-        <w:rPr>
-          <w:b/>
-          <w:color w:val="B91C1C"/>
-        </w:rPr>
-        <w:t>FAIL</w:t>
-      </w:r>
-    </w:p>
-    <w:p>
-      <w:pPr>
-        <w:pStyle w:val="Heading2"/>
-      </w:pPr>
-      <w:r>
-        <w:t>Steps to see it</w:t>
-      </w:r>
-    </w:p>
-    <w:p>
-      <w:pPr>
-        <w:pStyle w:val="ListNumber"/>
-      </w:pPr>
-      <w:r>
-        <w:t>Open Customers.</w:t>
-      </w:r>
-    </w:p>
-    <w:p>
-      <w:pPr>
-        <w:pStyle w:val="ListNumber"/>
-      </w:pPr>
-      <w:r>
-        <w:t>Look at the "Created" line under each name. These customers were added on 6 October 2026.</w:t>
-      </w:r>
-    </w:p>
-    <w:p>
-      <w:pPr>
-        <w:pStyle w:val="Heading2"/>
-      </w:pPr>
-      <w:r>
-        <w:t>Expected output</w:t>
-      </w:r>
-    </w:p>
-    <w:p>
-      <w:r>
-        <w:t>Created 6/10/2026</w:t>
+        <w:t>Expected:</w:t>
       </w:r>
     </w:p>
     <w:p>
       <w:r>
         <w:drawing>
           <wp:inline xmlns:a="http://schemas.openxmlformats.org/drawingml/2006/main" xmlns:pic="http://schemas.openxmlformats.org/drawingml/2006/picture">
-            <wp:extent cx="5669280" cy="3735250"/>
+            <wp:extent cx="3931920" cy="2590577"/>
             <wp:docPr id="11" name="Picture 11"/>
             <wp:cNvGraphicFramePr>
               <a:graphicFrameLocks noChangeAspect="1"/>
@@ -1836,7 +3058,7 @@
                   <pic:spPr>
                     <a:xfrm>
                       <a:off x="0" y="0"/>
-                      <a:ext cx="5669280" cy="3735250"/>
+                      <a:ext cx="3931920" cy="2590577"/>
                     </a:xfrm>
                     <a:prstGeom prst="rect"/>
                   </pic:spPr>
@@ -1848,31 +3070,22 @@
       </w:r>
     </w:p>
     <w:p>
+      <w:pPr>
+        <w:keepNext/>
+        <w:spacing w:before="160"/>
+      </w:pPr>
       <w:r>
         <w:rPr>
-          <w:i/>
+          <w:b/>
         </w:rPr>
-        <w:t>Screenshot: main app (correct)</w:t>
-      </w:r>
-    </w:p>
-    <w:p>
-      <w:pPr>
-        <w:pStyle w:val="Heading2"/>
-      </w:pPr>
-      <w:r>
-        <w:t>Actual output (coming output)</w:t>
-      </w:r>
-    </w:p>
-    <w:p>
-      <w:r>
-        <w:t>Created 6/9/2026 -- one month early. In January it would even show month 0.</w:t>
+        <w:t>Actual:</w:t>
       </w:r>
     </w:p>
     <w:p>
       <w:r>
         <w:drawing>
           <wp:inline xmlns:a="http://schemas.openxmlformats.org/drawingml/2006/main" xmlns:pic="http://schemas.openxmlformats.org/drawingml/2006/picture">
-            <wp:extent cx="5669280" cy="3735250"/>
+            <wp:extent cx="3931920" cy="2590577"/>
             <wp:docPr id="12" name="Picture 12"/>
             <wp:cNvGraphicFramePr>
               <a:graphicFrameLocks noChangeAspect="1"/>
@@ -1893,7 +3106,7 @@
                   <pic:spPr>
                     <a:xfrm>
                       <a:off x="0" y="0"/>
-                      <a:ext cx="5669280" cy="3735250"/>
+                      <a:ext cx="3931920" cy="2590577"/>
                     </a:xfrm>
                     <a:prstGeom prst="rect"/>
                   </pic:spPr>
@@ -1905,165 +3118,302 @@
       </w:r>
     </w:p>
     <w:p>
+      <w:pPr>
+        <w:pStyle w:val="Heading1"/>
+        <w:pageBreakBefore/>
+      </w:pPr>
       <w:r>
-        <w:rPr>
-          <w:i/>
-        </w:rPr>
-        <w:t>Screenshot: bug branch (wrong)</w:t>
+        <w:t>BUG-07 - Top supplier rank starts from #0</w:t>
       </w:r>
     </w:p>
+    <w:tbl>
+      <w:tblPr>
+        <w:tblStyle w:val="TableGrid"/>
+        <w:tblW w:type="auto" w:w="0"/>
+        <w:tblLook w:firstColumn="1" w:firstRow="1" w:lastColumn="0" w:lastRow="0" w:noHBand="0" w:noVBand="1" w:val="04A0"/>
+      </w:tblPr>
+      <w:tblGrid>
+        <w:gridCol w:w="4320"/>
+        <w:gridCol w:w="4320"/>
+      </w:tblGrid>
+      <w:tr>
+        <w:tc>
+          <w:tcPr>
+            <w:tcW w:type="dxa" w:w="2016"/>
+          </w:tcPr>
+          <w:p>
+            <w:r>
+              <w:rPr>
+                <w:b/>
+              </w:rPr>
+              <w:t>Module</w:t>
+            </w:r>
+          </w:p>
+        </w:tc>
+        <w:tc>
+          <w:tcPr>
+            <w:tcW w:type="dxa" w:w="6912"/>
+          </w:tcPr>
+          <w:p>
+            <w:r>
+              <w:rPr>
+                <w:b w:val="0"/>
+              </w:rPr>
+              <w:t>Dashboard</w:t>
+            </w:r>
+          </w:p>
+        </w:tc>
+      </w:tr>
+      <w:tr>
+        <w:tc>
+          <w:tcPr>
+            <w:tcW w:type="dxa" w:w="2016"/>
+          </w:tcPr>
+          <w:p>
+            <w:r>
+              <w:rPr>
+                <w:b/>
+              </w:rPr>
+              <w:t>Severity</w:t>
+            </w:r>
+          </w:p>
+        </w:tc>
+        <w:tc>
+          <w:tcPr>
+            <w:tcW w:type="dxa" w:w="6912"/>
+          </w:tcPr>
+          <w:p>
+            <w:r>
+              <w:rPr>
+                <w:b w:val="0"/>
+              </w:rPr>
+              <w:t>Minor</w:t>
+            </w:r>
+          </w:p>
+        </w:tc>
+      </w:tr>
+      <w:tr>
+        <w:tc>
+          <w:tcPr>
+            <w:tcW w:type="dxa" w:w="2016"/>
+          </w:tcPr>
+          <w:p>
+            <w:r>
+              <w:rPr>
+                <w:b/>
+              </w:rPr>
+              <w:t>Priority</w:t>
+            </w:r>
+          </w:p>
+        </w:tc>
+        <w:tc>
+          <w:tcPr>
+            <w:tcW w:type="dxa" w:w="6912"/>
+          </w:tcPr>
+          <w:p>
+            <w:r>
+              <w:rPr>
+                <w:b w:val="0"/>
+              </w:rPr>
+              <w:t>Low</w:t>
+            </w:r>
+          </w:p>
+        </w:tc>
+      </w:tr>
+      <w:tr>
+        <w:tc>
+          <w:tcPr>
+            <w:tcW w:type="dxa" w:w="2016"/>
+          </w:tcPr>
+          <w:p>
+            <w:r>
+              <w:rPr>
+                <w:b/>
+              </w:rPr>
+              <w:t>Status</w:t>
+            </w:r>
+          </w:p>
+        </w:tc>
+        <w:tc>
+          <w:tcPr>
+            <w:tcW w:type="dxa" w:w="6912"/>
+          </w:tcPr>
+          <w:p>
+            <w:r>
+              <w:rPr>
+                <w:b w:val="0"/>
+              </w:rPr>
+              <w:t>Open</w:t>
+            </w:r>
+          </w:p>
+        </w:tc>
+      </w:tr>
+      <w:tr>
+        <w:tc>
+          <w:tcPr>
+            <w:tcW w:type="dxa" w:w="2016"/>
+          </w:tcPr>
+          <w:p>
+            <w:r>
+              <w:rPr>
+                <w:b/>
+              </w:rPr>
+              <w:t>Steps</w:t>
+            </w:r>
+          </w:p>
+        </w:tc>
+        <w:tc>
+          <w:tcPr>
+            <w:tcW w:type="dxa" w:w="6912"/>
+          </w:tcPr>
+          <w:p>
+            <w:r>
+              <w:rPr>
+                <w:b w:val="0"/>
+              </w:rPr>
+              <w:t>1. Go to Dashboard &gt; Analytics.</w:t>
+            </w:r>
+          </w:p>
+          <w:p>
+            <w:r>
+              <w:rPr>
+                <w:b w:val="0"/>
+              </w:rPr>
+              <w:t>2. Check the Top Suppliers card.</w:t>
+            </w:r>
+          </w:p>
+        </w:tc>
+      </w:tr>
+      <w:tr>
+        <w:tc>
+          <w:tcPr>
+            <w:tcW w:type="dxa" w:w="2016"/>
+          </w:tcPr>
+          <w:p>
+            <w:r>
+              <w:rPr>
+                <w:b/>
+              </w:rPr>
+              <w:t>Expected Result</w:t>
+            </w:r>
+          </w:p>
+        </w:tc>
+        <w:tc>
+          <w:tcPr>
+            <w:tcW w:type="dxa" w:w="6912"/>
+          </w:tcPr>
+          <w:p>
+            <w:r>
+              <w:rPr>
+                <w:b w:val="0"/>
+              </w:rPr>
+              <w:t>Kanchi Weavers #1, Jaipur Cotton House #2.</w:t>
+            </w:r>
+          </w:p>
+        </w:tc>
+      </w:tr>
+      <w:tr>
+        <w:tc>
+          <w:tcPr>
+            <w:tcW w:type="dxa" w:w="2016"/>
+          </w:tcPr>
+          <w:p>
+            <w:r>
+              <w:rPr>
+                <w:b/>
+              </w:rPr>
+              <w:t>Actual Result</w:t>
+            </w:r>
+          </w:p>
+        </w:tc>
+        <w:tc>
+          <w:tcPr>
+            <w:tcW w:type="dxa" w:w="6912"/>
+          </w:tcPr>
+          <w:p>
+            <w:r>
+              <w:rPr>
+                <w:b w:val="0"/>
+              </w:rPr>
+              <w:t>Kanchi Weavers #0, Jaipur Cotton House #1.</w:t>
+            </w:r>
+          </w:p>
+        </w:tc>
+      </w:tr>
+      <w:tr>
+        <w:tc>
+          <w:tcPr>
+            <w:tcW w:type="dxa" w:w="2016"/>
+          </w:tcPr>
+          <w:p>
+            <w:r>
+              <w:rPr>
+                <w:b/>
+              </w:rPr>
+              <w:t>File / Line</w:t>
+            </w:r>
+          </w:p>
+        </w:tc>
+        <w:tc>
+          <w:tcPr>
+            <w:tcW w:type="dxa" w:w="6912"/>
+          </w:tcPr>
+          <w:p>
+            <w:r>
+              <w:rPr>
+                <w:b w:val="0"/>
+              </w:rPr>
+              <w:t>src/components/dashboard/SupplierSpendWidget.jsx : 56</w:t>
+            </w:r>
+          </w:p>
+        </w:tc>
+      </w:tr>
+      <w:tr>
+        <w:tc>
+          <w:tcPr>
+            <w:tcW w:type="dxa" w:w="2016"/>
+          </w:tcPr>
+          <w:p>
+            <w:r>
+              <w:rPr>
+                <w:b/>
+              </w:rPr>
+              <w:t>Root Cause</w:t>
+            </w:r>
+          </w:p>
+        </w:tc>
+        <w:tc>
+          <w:tcPr>
+            <w:tcW w:type="dxa" w:w="6912"/>
+          </w:tcPr>
+          <w:p>
+            <w:r>
+              <w:rPr>
+                <w:b w:val="0"/>
+              </w:rPr>
+              <w:t>Rank is shown as index. It should be index + 1.</w:t>
+            </w:r>
+          </w:p>
+        </w:tc>
+      </w:tr>
+    </w:tbl>
     <w:p>
       <w:pPr>
-        <w:pStyle w:val="Heading2"/>
+        <w:keepNext/>
+        <w:spacing w:before="160"/>
       </w:pPr>
-      <w:r>
-        <w:t>Where the system breaks</w:t>
-      </w:r>
-    </w:p>
-    <w:p>
-      <w:pPr>
-        <w:pStyle w:val="ListBullet"/>
-      </w:pPr>
-      <w:r>
-        <w:t>File: src/pages/sales/Customers.jsx, line 186</w:t>
-      </w:r>
-    </w:p>
-    <w:p>
-      <w:pPr>
-        <w:pStyle w:val="ListBullet"/>
-      </w:pPr>
-      <w:r>
-        <w:t xml:space="preserve">Wrong code (now): </w:t>
-      </w:r>
-      <w:r>
-        <w:rPr>
-          <w:rFonts w:ascii="Consolas" w:hAnsi="Consolas"/>
-        </w:rPr>
-        <w:t>Created {`${d.getDate()}/${d.getMonth()}/${d.getFullYear()}`}   (d = new Date(customer.createdAt))</w:t>
-      </w:r>
-    </w:p>
-    <w:p>
-      <w:pPr>
-        <w:pStyle w:val="ListBullet"/>
-      </w:pPr>
-      <w:r>
-        <w:t xml:space="preserve">Right code: </w:t>
-      </w:r>
-      <w:r>
-        <w:rPr>
-          <w:rFonts w:ascii="Consolas" w:hAnsi="Consolas"/>
-        </w:rPr>
-        <w:t>Created {new Date(customer.createdAt).toLocaleDateString()}</w:t>
-      </w:r>
-    </w:p>
-    <w:p>
-      <w:pPr>
-        <w:pStyle w:val="ListBullet"/>
-      </w:pPr>
-      <w:r>
-        <w:t>Why: In JavaScript getMonth() counts months from 0 (January = 0), so October comes out as 9.</w:t>
-      </w:r>
-    </w:p>
-    <w:p>
-      <w:r>
-        <w:br w:type="page"/>
-      </w:r>
-    </w:p>
-    <w:p>
-      <w:pPr>
-        <w:pStyle w:val="Heading1"/>
-      </w:pPr>
-      <w:r>
-        <w:t>BUG-07: Dashboard: the top supplier is ranked "#0"</w:t>
-      </w:r>
-    </w:p>
-    <w:p>
       <w:r>
         <w:rPr>
           <w:b/>
         </w:rPr>
-        <w:t xml:space="preserve">Page: </w:t>
-      </w:r>
-      <w:r>
-        <w:t>Dashboard, Analytics tab, "Top Suppliers" card  (/dashboard)</w:t>
-      </w:r>
-    </w:p>
-    <w:p>
-      <w:r>
-        <w:rPr>
-          <w:b/>
-        </w:rPr>
-        <w:t xml:space="preserve">Severity: </w:t>
-      </w:r>
-      <w:r>
-        <w:t>Minor (looks wrong)</w:t>
-      </w:r>
-    </w:p>
-    <w:p>
-      <w:r>
-        <w:rPr>
-          <w:b/>
-        </w:rPr>
-        <w:t xml:space="preserve">Result: </w:t>
-      </w:r>
-      <w:r>
-        <w:rPr>
-          <w:b/>
-          <w:color w:val="B91C1C"/>
-        </w:rPr>
-        <w:t>FAIL</w:t>
-      </w:r>
-    </w:p>
-    <w:p>
-      <w:pPr>
-        <w:pStyle w:val="Heading2"/>
-      </w:pPr>
-      <w:r>
-        <w:t>Steps to see it</w:t>
-      </w:r>
-    </w:p>
-    <w:p>
-      <w:pPr>
-        <w:pStyle w:val="ListNumber"/>
-      </w:pPr>
-      <w:r>
-        <w:t>Open Dashboard.</w:t>
-      </w:r>
-    </w:p>
-    <w:p>
-      <w:pPr>
-        <w:pStyle w:val="ListNumber"/>
-      </w:pPr>
-      <w:r>
-        <w:t>Click the Analytics tab.</w:t>
-      </w:r>
-    </w:p>
-    <w:p>
-      <w:pPr>
-        <w:pStyle w:val="ListNumber"/>
-      </w:pPr>
-      <w:r>
-        <w:t>Scroll down to "Top Suppliers".</w:t>
-      </w:r>
-    </w:p>
-    <w:p>
-      <w:pPr>
-        <w:pStyle w:val="Heading2"/>
-      </w:pPr>
-      <w:r>
-        <w:t>Expected output</w:t>
-      </w:r>
-    </w:p>
-    <w:p>
-      <w:r>
-        <w:t>Kanchi Weavers is #1, Jaipur Cotton House is #2.</w:t>
+        <w:t>Expected:</w:t>
       </w:r>
     </w:p>
     <w:p>
       <w:r>
         <w:drawing>
           <wp:inline xmlns:a="http://schemas.openxmlformats.org/drawingml/2006/main" xmlns:pic="http://schemas.openxmlformats.org/drawingml/2006/picture">
-            <wp:extent cx="5669280" cy="3735250"/>
+            <wp:extent cx="3931920" cy="2590577"/>
             <wp:docPr id="13" name="Picture 13"/>
             <wp:cNvGraphicFramePr>
               <a:graphicFrameLocks noChangeAspect="1"/>
@@ -2084,7 +3434,7 @@
                   <pic:spPr>
                     <a:xfrm>
                       <a:off x="0" y="0"/>
-                      <a:ext cx="5669280" cy="3735250"/>
+                      <a:ext cx="3931920" cy="2590577"/>
                     </a:xfrm>
                     <a:prstGeom prst="rect"/>
                   </pic:spPr>
@@ -2096,31 +3446,22 @@
       </w:r>
     </w:p>
     <w:p>
+      <w:pPr>
+        <w:keepNext/>
+        <w:spacing w:before="160"/>
+      </w:pPr>
       <w:r>
         <w:rPr>
-          <w:i/>
+          <w:b/>
         </w:rPr>
-        <w:t>Screenshot: main app (correct)</w:t>
-      </w:r>
-    </w:p>
-    <w:p>
-      <w:pPr>
-        <w:pStyle w:val="Heading2"/>
-      </w:pPr>
-      <w:r>
-        <w:t>Actual output (coming output)</w:t>
-      </w:r>
-    </w:p>
-    <w:p>
-      <w:r>
-        <w:t>Kanchi Weavers is #0, Jaipur Cotton House is #1.</w:t>
+        <w:t>Actual:</w:t>
       </w:r>
     </w:p>
     <w:p>
       <w:r>
         <w:drawing>
           <wp:inline xmlns:a="http://schemas.openxmlformats.org/drawingml/2006/main" xmlns:pic="http://schemas.openxmlformats.org/drawingml/2006/picture">
-            <wp:extent cx="5669280" cy="3735250"/>
+            <wp:extent cx="3931920" cy="2590577"/>
             <wp:docPr id="14" name="Picture 14"/>
             <wp:cNvGraphicFramePr>
               <a:graphicFrameLocks noChangeAspect="1"/>
@@ -2141,7 +3482,7 @@
                   <pic:spPr>
                     <a:xfrm>
                       <a:off x="0" y="0"/>
-                      <a:ext cx="5669280" cy="3735250"/>
+                      <a:ext cx="3931920" cy="2590577"/>
                     </a:xfrm>
                     <a:prstGeom prst="rect"/>
                   </pic:spPr>
@@ -2152,69 +3493,9 @@
         </w:drawing>
       </w:r>
     </w:p>
-    <w:p>
-      <w:r>
-        <w:rPr>
-          <w:i/>
-        </w:rPr>
-        <w:t>Screenshot: bug branch (wrong)</w:t>
-      </w:r>
-    </w:p>
-    <w:p>
-      <w:pPr>
-        <w:pStyle w:val="Heading2"/>
-      </w:pPr>
-      <w:r>
-        <w:t>Where the system breaks</w:t>
-      </w:r>
-    </w:p>
-    <w:p>
-      <w:pPr>
-        <w:pStyle w:val="ListBullet"/>
-      </w:pPr>
-      <w:r>
-        <w:t>File: src/components/dashboard/SupplierSpendWidget.jsx, line 56</w:t>
-      </w:r>
-    </w:p>
-    <w:p>
-      <w:pPr>
-        <w:pStyle w:val="ListBullet"/>
-      </w:pPr>
-      <w:r>
-        <w:t xml:space="preserve">Wrong code (now): </w:t>
-      </w:r>
-      <w:r>
-        <w:rPr>
-          <w:rFonts w:ascii="Consolas" w:hAnsi="Consolas"/>
-        </w:rPr>
-        <w:t>#{index}</w:t>
-      </w:r>
-    </w:p>
-    <w:p>
-      <w:pPr>
-        <w:pStyle w:val="ListBullet"/>
-      </w:pPr>
-      <w:r>
-        <w:t xml:space="preserve">Right code: </w:t>
-      </w:r>
-      <w:r>
-        <w:rPr>
-          <w:rFonts w:ascii="Consolas" w:hAnsi="Consolas"/>
-        </w:rPr>
-        <w:t>#{index + 1}</w:t>
-      </w:r>
-    </w:p>
-    <w:p>
-      <w:pPr>
-        <w:pStyle w:val="ListBullet"/>
-      </w:pPr>
-      <w:r>
-        <w:t>Why: The list position starts from 0 in code. The code forgot to add 1 before showing it.</w:t>
-      </w:r>
-    </w:p>
     <w:sectPr>
       <w:pgSz w:w="12240" w:h="15840"/>
-      <w:pgMar w:top="1440" w:right="1800" w:bottom="1440" w:left="1800" w:header="720" w:footer="720" w:gutter="0"/>
+      <w:pgMar w:top="1008" w:right="1800" w:bottom="1008" w:left="1800" w:header="720" w:footer="720" w:gutter="0"/>
       <w:cols w:space="720"/>
       <w:docGrid w:linePitch="360"/>
     </w:sectPr>
@@ -2587,6 +3868,7 @@
     <w:rsid w:val="00FC693F"/>
     <w:rPr>
       <w:rFonts w:ascii="Calibri" w:hAnsi="Calibri"/>
+      <w:color w:val="000000"/>
       <w:sz w:val="21"/>
     </w:rPr>
   </w:style>
@@ -2649,11 +3931,11 @@
       <w:outlineLvl w:val="0"/>
     </w:pPr>
     <w:rPr>
-      <w:rFonts w:asciiTheme="majorHAnsi" w:eastAsiaTheme="majorEastAsia" w:hAnsiTheme="majorHAnsi" w:cstheme="majorBidi"/>
+      <w:rFonts w:asciiTheme="majorHAnsi" w:eastAsiaTheme="majorEastAsia" w:hAnsiTheme="majorHAnsi" w:cstheme="majorBidi" w:ascii="Calibri" w:hAnsi="Calibri"/>
       <w:b/>
       <w:bCs/>
-      <w:color w:val="365F91" w:themeColor="accent1" w:themeShade="BF"/>
-      <w:sz w:val="28"/>
+      <w:color w:val="000000"/>
+      <w:sz w:val="26"/>
       <w:szCs w:val="28"/>
     </w:rPr>
   </w:style>
@@ -2673,10 +3955,10 @@
       <w:outlineLvl w:val="1"/>
     </w:pPr>
     <w:rPr>
-      <w:rFonts w:asciiTheme="majorHAnsi" w:eastAsiaTheme="majorEastAsia" w:hAnsiTheme="majorHAnsi" w:cstheme="majorBidi"/>
+      <w:rFonts w:asciiTheme="majorHAnsi" w:eastAsiaTheme="majorEastAsia" w:hAnsiTheme="majorHAnsi" w:cstheme="majorBidi" w:ascii="Calibri" w:hAnsi="Calibri"/>
       <w:b/>
       <w:bCs/>
-      <w:color w:val="4F81BD" w:themeColor="accent1"/>
+      <w:color w:val="000000"/>
       <w:sz w:val="26"/>
       <w:szCs w:val="26"/>
     </w:rPr>
@@ -2938,8 +4220,8 @@
       <w:contextualSpacing/>
     </w:pPr>
     <w:rPr>
-      <w:rFonts w:asciiTheme="majorHAnsi" w:eastAsiaTheme="majorEastAsia" w:hAnsiTheme="majorHAnsi" w:cstheme="majorBidi"/>
-      <w:color w:val="17365D" w:themeColor="text2" w:themeShade="BF"/>
+      <w:rFonts w:asciiTheme="majorHAnsi" w:eastAsiaTheme="majorEastAsia" w:hAnsiTheme="majorHAnsi" w:cstheme="majorBidi" w:ascii="Calibri" w:hAnsi="Calibri"/>
+      <w:color w:val="000000"/>
       <w:spacing w:val="5"/>
       <w:kern w:val="28"/>
       <w:sz w:val="52"/>

</xml_diff>